<commit_message>
Correction to the project documentation in the table of contents section.
</commit_message>
<xml_diff>
--- a/Documentacion_Proyecto_Final.docx
+++ b/Documentacion_Proyecto_Final.docx
@@ -136,7 +136,7 @@
           <w:r>
             <w:fldChar w:fldCharType="separate"/>
           </w:r>
-          <w:hyperlink w:anchor="_Toc241309492" w:history="1">
+          <w:hyperlink w:anchor="_Toc241316301" w:history="1">
             <w:r>
               <w:rPr>
                 <w:rStyle w:val="Hipervnculo"/>
@@ -183,7 +183,7 @@
                 <w:noProof/>
                 <w:webHidden/>
               </w:rPr>
-              <w:instrText xml:space="preserve"> PAGEREF _Toc241309492 \h </w:instrText>
+              <w:instrText xml:space="preserve"> PAGEREF _Toc241316301 \h </w:instrText>
             </w:r>
             <w:r>
               <w:rPr>
@@ -226,7 +226,7 @@
               <w:lang w:eastAsia="es-MX"/>
             </w:rPr>
           </w:pPr>
-          <w:hyperlink w:anchor="_Toc241309493" w:history="1">
+          <w:hyperlink w:anchor="_Toc241316302" w:history="1">
             <w:r>
               <w:rPr>
                 <w:rStyle w:val="Hipervnculo"/>
@@ -256,7 +256,7 @@
                 <w:noProof/>
                 <w:webHidden/>
               </w:rPr>
-              <w:instrText xml:space="preserve"> PAGEREF _Toc241309493 \h </w:instrText>
+              <w:instrText xml:space="preserve"> PAGEREF _Toc241316302 \h </w:instrText>
             </w:r>
             <w:r>
               <w:rPr>
@@ -299,7 +299,7 @@
               <w:lang w:eastAsia="es-MX"/>
             </w:rPr>
           </w:pPr>
-          <w:hyperlink w:anchor="_Toc241309494" w:history="1">
+          <w:hyperlink w:anchor="_Toc241316303" w:history="1">
             <w:r>
               <w:rPr>
                 <w:rStyle w:val="Hipervnculo"/>
@@ -329,7 +329,7 @@
                 <w:noProof/>
                 <w:webHidden/>
               </w:rPr>
-              <w:instrText xml:space="preserve"> PAGEREF _Toc241309494 \h </w:instrText>
+              <w:instrText xml:space="preserve"> PAGEREF _Toc241316303 \h </w:instrText>
             </w:r>
             <w:r>
               <w:rPr>
@@ -372,7 +372,7 @@
               <w:lang w:eastAsia="es-MX"/>
             </w:rPr>
           </w:pPr>
-          <w:hyperlink w:anchor="_Toc241309495" w:history="1">
+          <w:hyperlink w:anchor="_Toc241316304" w:history="1">
             <w:r>
               <w:rPr>
                 <w:rStyle w:val="Hipervnculo"/>
@@ -402,7 +402,7 @@
                 <w:noProof/>
                 <w:webHidden/>
               </w:rPr>
-              <w:instrText xml:space="preserve"> PAGEREF _Toc241309495 \h </w:instrText>
+              <w:instrText xml:space="preserve"> PAGEREF _Toc241316304 \h </w:instrText>
             </w:r>
             <w:r>
               <w:rPr>
@@ -440,10 +440,12 @@
               <w:tab w:val="right" w:leader="dot" w:pos="8828"/>
             </w:tabs>
             <w:rPr>
+              <w:rFonts w:eastAsiaTheme="minorEastAsia"/>
               <w:noProof/>
+              <w:lang w:eastAsia="es-MX"/>
             </w:rPr>
           </w:pPr>
-          <w:hyperlink w:anchor="_Toc241309496" w:history="1">
+          <w:hyperlink w:anchor="_Toc241316305" w:history="1">
             <w:r>
               <w:rPr>
                 <w:rStyle w:val="Hipervnculo"/>
@@ -473,7 +475,7 @@
                 <w:noProof/>
                 <w:webHidden/>
               </w:rPr>
-              <w:instrText xml:space="preserve"> PAGEREF _Toc241309496 \h </w:instrText>
+              <w:instrText xml:space="preserve"> PAGEREF _Toc241316305 \h </w:instrText>
             </w:r>
             <w:r>
               <w:rPr>
@@ -511,10 +513,12 @@
               <w:tab w:val="right" w:leader="dot" w:pos="8828"/>
             </w:tabs>
             <w:rPr>
+              <w:rFonts w:eastAsiaTheme="minorEastAsia"/>
               <w:noProof/>
+              <w:lang w:eastAsia="es-MX"/>
             </w:rPr>
           </w:pPr>
-          <w:hyperlink w:anchor="_Toc241309497" w:history="1">
+          <w:hyperlink w:anchor="_Toc241316306" w:history="1">
             <w:r>
               <w:rPr>
                 <w:rStyle w:val="Hipervnculo"/>
@@ -544,7 +548,7 @@
                 <w:noProof/>
                 <w:webHidden/>
               </w:rPr>
-              <w:instrText xml:space="preserve"> PAGEREF _Toc241309497 \h </w:instrText>
+              <w:instrText xml:space="preserve"> PAGEREF _Toc241316306 \h </w:instrText>
             </w:r>
             <w:r>
               <w:rPr>
@@ -582,10 +586,12 @@
               <w:tab w:val="right" w:leader="dot" w:pos="8828"/>
             </w:tabs>
             <w:rPr>
+              <w:rFonts w:eastAsiaTheme="minorEastAsia"/>
               <w:noProof/>
+              <w:lang w:eastAsia="es-MX"/>
             </w:rPr>
           </w:pPr>
-          <w:hyperlink w:anchor="_Toc241309498" w:history="1">
+          <w:hyperlink w:anchor="_Toc241316307" w:history="1">
             <w:r>
               <w:rPr>
                 <w:rStyle w:val="Hipervnculo"/>
@@ -615,7 +621,7 @@
                 <w:noProof/>
                 <w:webHidden/>
               </w:rPr>
-              <w:instrText xml:space="preserve"> PAGEREF _Toc241309498 \h </w:instrText>
+              <w:instrText xml:space="preserve"> PAGEREF _Toc241316307 \h </w:instrText>
             </w:r>
             <w:r>
               <w:rPr>
@@ -636,6 +642,736 @@
                 <w:webHidden/>
               </w:rPr>
               <w:t>8</w:t>
+            </w:r>
+            <w:r>
+              <w:rPr>
+                <w:noProof/>
+                <w:webHidden/>
+              </w:rPr>
+              <w:fldChar w:fldCharType="end"/>
+            </w:r>
+          </w:hyperlink>
+        </w:p>
+        <w:p>
+          <w:pPr>
+            <w:pStyle w:val="TDC2"/>
+            <w:tabs>
+              <w:tab w:val="right" w:leader="dot" w:pos="8828"/>
+            </w:tabs>
+            <w:rPr>
+              <w:rFonts w:eastAsiaTheme="minorEastAsia"/>
+              <w:noProof/>
+              <w:lang w:eastAsia="es-MX"/>
+            </w:rPr>
+          </w:pPr>
+          <w:hyperlink w:anchor="_Toc241316308" w:history="1">
+            <w:r>
+              <w:rPr>
+                <w:rStyle w:val="Hipervnculo"/>
+                <w:rFonts w:ascii="Open Sans" w:hAnsi="Open Sans" w:cs="Open Sans"/>
+                <w:b/>
+                <w:bCs/>
+                <w:noProof/>
+              </w:rPr>
+              <w:t>Estructura del Código</w:t>
+            </w:r>
+            <w:r>
+              <w:rPr>
+                <w:noProof/>
+                <w:webHidden/>
+              </w:rPr>
+              <w:tab/>
+            </w:r>
+            <w:r>
+              <w:rPr>
+                <w:noProof/>
+                <w:webHidden/>
+              </w:rPr>
+              <w:fldChar w:fldCharType="begin"/>
+            </w:r>
+            <w:r>
+              <w:rPr>
+                <w:noProof/>
+                <w:webHidden/>
+              </w:rPr>
+              <w:instrText xml:space="preserve"> PAGEREF _Toc241316308 \h </w:instrText>
+            </w:r>
+            <w:r>
+              <w:rPr>
+                <w:noProof/>
+                <w:webHidden/>
+              </w:rPr>
+            </w:r>
+            <w:r>
+              <w:rPr>
+                <w:noProof/>
+                <w:webHidden/>
+              </w:rPr>
+              <w:fldChar w:fldCharType="separate"/>
+            </w:r>
+            <w:r>
+              <w:rPr>
+                <w:noProof/>
+                <w:webHidden/>
+              </w:rPr>
+              <w:t>9</w:t>
+            </w:r>
+            <w:r>
+              <w:rPr>
+                <w:noProof/>
+                <w:webHidden/>
+              </w:rPr>
+              <w:fldChar w:fldCharType="end"/>
+            </w:r>
+          </w:hyperlink>
+        </w:p>
+        <w:p>
+          <w:pPr>
+            <w:pStyle w:val="TDC2"/>
+            <w:tabs>
+              <w:tab w:val="right" w:leader="dot" w:pos="8828"/>
+            </w:tabs>
+            <w:rPr>
+              <w:rFonts w:eastAsiaTheme="minorEastAsia"/>
+              <w:noProof/>
+              <w:lang w:eastAsia="es-MX"/>
+            </w:rPr>
+          </w:pPr>
+          <w:hyperlink w:anchor="_Toc241316309" w:history="1">
+            <w:r>
+              <w:rPr>
+                <w:rStyle w:val="Hipervnculo"/>
+                <w:rFonts w:ascii="Open Sans" w:hAnsi="Open Sans" w:cs="Open Sans"/>
+                <w:b/>
+                <w:bCs/>
+                <w:noProof/>
+              </w:rPr>
+              <w:t>Tabla de clases y responsabilidades</w:t>
+            </w:r>
+            <w:r>
+              <w:rPr>
+                <w:noProof/>
+                <w:webHidden/>
+              </w:rPr>
+              <w:tab/>
+            </w:r>
+            <w:r>
+              <w:rPr>
+                <w:noProof/>
+                <w:webHidden/>
+              </w:rPr>
+              <w:fldChar w:fldCharType="begin"/>
+            </w:r>
+            <w:r>
+              <w:rPr>
+                <w:noProof/>
+                <w:webHidden/>
+              </w:rPr>
+              <w:instrText xml:space="preserve"> PAGEREF _Toc241316309 \h </w:instrText>
+            </w:r>
+            <w:r>
+              <w:rPr>
+                <w:noProof/>
+                <w:webHidden/>
+              </w:rPr>
+            </w:r>
+            <w:r>
+              <w:rPr>
+                <w:noProof/>
+                <w:webHidden/>
+              </w:rPr>
+              <w:fldChar w:fldCharType="separate"/>
+            </w:r>
+            <w:r>
+              <w:rPr>
+                <w:noProof/>
+                <w:webHidden/>
+              </w:rPr>
+              <w:t>10</w:t>
+            </w:r>
+            <w:r>
+              <w:rPr>
+                <w:noProof/>
+                <w:webHidden/>
+              </w:rPr>
+              <w:fldChar w:fldCharType="end"/>
+            </w:r>
+          </w:hyperlink>
+        </w:p>
+        <w:p>
+          <w:pPr>
+            <w:pStyle w:val="TDC2"/>
+            <w:tabs>
+              <w:tab w:val="right" w:leader="dot" w:pos="8828"/>
+            </w:tabs>
+            <w:rPr>
+              <w:rFonts w:eastAsiaTheme="minorEastAsia"/>
+              <w:noProof/>
+              <w:lang w:eastAsia="es-MX"/>
+            </w:rPr>
+          </w:pPr>
+          <w:hyperlink w:anchor="_Toc241316310" w:history="1">
+            <w:r>
+              <w:rPr>
+                <w:rStyle w:val="Hipervnculo"/>
+                <w:rFonts w:ascii="Open Sans" w:hAnsi="Open Sans" w:cs="Open Sans"/>
+                <w:b/>
+                <w:bCs/>
+                <w:noProof/>
+              </w:rPr>
+              <w:t>Fichas técnicas de las clases del sistema</w:t>
+            </w:r>
+            <w:r>
+              <w:rPr>
+                <w:noProof/>
+                <w:webHidden/>
+              </w:rPr>
+              <w:tab/>
+            </w:r>
+            <w:r>
+              <w:rPr>
+                <w:noProof/>
+                <w:webHidden/>
+              </w:rPr>
+              <w:fldChar w:fldCharType="begin"/>
+            </w:r>
+            <w:r>
+              <w:rPr>
+                <w:noProof/>
+                <w:webHidden/>
+              </w:rPr>
+              <w:instrText xml:space="preserve"> PAGEREF _Toc241316310 \h </w:instrText>
+            </w:r>
+            <w:r>
+              <w:rPr>
+                <w:noProof/>
+                <w:webHidden/>
+              </w:rPr>
+            </w:r>
+            <w:r>
+              <w:rPr>
+                <w:noProof/>
+                <w:webHidden/>
+              </w:rPr>
+              <w:fldChar w:fldCharType="separate"/>
+            </w:r>
+            <w:r>
+              <w:rPr>
+                <w:noProof/>
+                <w:webHidden/>
+              </w:rPr>
+              <w:t>12</w:t>
+            </w:r>
+            <w:r>
+              <w:rPr>
+                <w:noProof/>
+                <w:webHidden/>
+              </w:rPr>
+              <w:fldChar w:fldCharType="end"/>
+            </w:r>
+          </w:hyperlink>
+        </w:p>
+        <w:p>
+          <w:pPr>
+            <w:pStyle w:val="TDC2"/>
+            <w:tabs>
+              <w:tab w:val="right" w:leader="dot" w:pos="8828"/>
+            </w:tabs>
+            <w:rPr>
+              <w:rFonts w:eastAsiaTheme="minorEastAsia"/>
+              <w:noProof/>
+              <w:lang w:eastAsia="es-MX"/>
+            </w:rPr>
+          </w:pPr>
+          <w:hyperlink w:anchor="_Toc241316311" w:history="1">
+            <w:r>
+              <w:rPr>
+                <w:rStyle w:val="Hipervnculo"/>
+                <w:rFonts w:ascii="Open Sans" w:hAnsi="Open Sans" w:cs="Open Sans"/>
+                <w:b/>
+                <w:bCs/>
+                <w:noProof/>
+              </w:rPr>
+              <w:t>Relación de las clases con el patrón MVC</w:t>
+            </w:r>
+            <w:r>
+              <w:rPr>
+                <w:noProof/>
+                <w:webHidden/>
+              </w:rPr>
+              <w:tab/>
+            </w:r>
+            <w:r>
+              <w:rPr>
+                <w:noProof/>
+                <w:webHidden/>
+              </w:rPr>
+              <w:fldChar w:fldCharType="begin"/>
+            </w:r>
+            <w:r>
+              <w:rPr>
+                <w:noProof/>
+                <w:webHidden/>
+              </w:rPr>
+              <w:instrText xml:space="preserve"> PAGEREF _Toc241316311 \h </w:instrText>
+            </w:r>
+            <w:r>
+              <w:rPr>
+                <w:noProof/>
+                <w:webHidden/>
+              </w:rPr>
+            </w:r>
+            <w:r>
+              <w:rPr>
+                <w:noProof/>
+                <w:webHidden/>
+              </w:rPr>
+              <w:fldChar w:fldCharType="separate"/>
+            </w:r>
+            <w:r>
+              <w:rPr>
+                <w:noProof/>
+                <w:webHidden/>
+              </w:rPr>
+              <w:t>20</w:t>
+            </w:r>
+            <w:r>
+              <w:rPr>
+                <w:noProof/>
+                <w:webHidden/>
+              </w:rPr>
+              <w:fldChar w:fldCharType="end"/>
+            </w:r>
+          </w:hyperlink>
+        </w:p>
+        <w:p>
+          <w:pPr>
+            <w:pStyle w:val="TDC2"/>
+            <w:tabs>
+              <w:tab w:val="right" w:leader="dot" w:pos="8828"/>
+            </w:tabs>
+            <w:rPr>
+              <w:rFonts w:eastAsiaTheme="minorEastAsia"/>
+              <w:noProof/>
+              <w:lang w:eastAsia="es-MX"/>
+            </w:rPr>
+          </w:pPr>
+          <w:hyperlink w:anchor="_Toc241316312" w:history="1">
+            <w:r>
+              <w:rPr>
+                <w:rStyle w:val="Hipervnculo"/>
+                <w:rFonts w:ascii="Open Sans" w:hAnsi="Open Sans" w:cs="Open Sans"/>
+                <w:b/>
+                <w:bCs/>
+                <w:noProof/>
+              </w:rPr>
+              <w:t>Explicación Detallada de Cada Componente</w:t>
+            </w:r>
+            <w:r>
+              <w:rPr>
+                <w:noProof/>
+                <w:webHidden/>
+              </w:rPr>
+              <w:tab/>
+            </w:r>
+            <w:r>
+              <w:rPr>
+                <w:noProof/>
+                <w:webHidden/>
+              </w:rPr>
+              <w:fldChar w:fldCharType="begin"/>
+            </w:r>
+            <w:r>
+              <w:rPr>
+                <w:noProof/>
+                <w:webHidden/>
+              </w:rPr>
+              <w:instrText xml:space="preserve"> PAGEREF _Toc241316312 \h </w:instrText>
+            </w:r>
+            <w:r>
+              <w:rPr>
+                <w:noProof/>
+                <w:webHidden/>
+              </w:rPr>
+            </w:r>
+            <w:r>
+              <w:rPr>
+                <w:noProof/>
+                <w:webHidden/>
+              </w:rPr>
+              <w:fldChar w:fldCharType="separate"/>
+            </w:r>
+            <w:r>
+              <w:rPr>
+                <w:noProof/>
+                <w:webHidden/>
+              </w:rPr>
+              <w:t>22</w:t>
+            </w:r>
+            <w:r>
+              <w:rPr>
+                <w:noProof/>
+                <w:webHidden/>
+              </w:rPr>
+              <w:fldChar w:fldCharType="end"/>
+            </w:r>
+          </w:hyperlink>
+        </w:p>
+        <w:p>
+          <w:pPr>
+            <w:pStyle w:val="TDC2"/>
+            <w:tabs>
+              <w:tab w:val="right" w:leader="dot" w:pos="8828"/>
+            </w:tabs>
+            <w:rPr>
+              <w:rFonts w:eastAsiaTheme="minorEastAsia"/>
+              <w:noProof/>
+              <w:lang w:eastAsia="es-MX"/>
+            </w:rPr>
+          </w:pPr>
+          <w:hyperlink w:anchor="_Toc241316313" w:history="1">
+            <w:r>
+              <w:rPr>
+                <w:rStyle w:val="Hipervnculo"/>
+                <w:rFonts w:ascii="Open Sans" w:hAnsi="Open Sans" w:cs="Open Sans"/>
+                <w:b/>
+                <w:bCs/>
+                <w:noProof/>
+              </w:rPr>
+              <w:t>Complejidad de las principales operaciones</w:t>
+            </w:r>
+            <w:r>
+              <w:rPr>
+                <w:noProof/>
+                <w:webHidden/>
+              </w:rPr>
+              <w:tab/>
+            </w:r>
+            <w:r>
+              <w:rPr>
+                <w:noProof/>
+                <w:webHidden/>
+              </w:rPr>
+              <w:fldChar w:fldCharType="begin"/>
+            </w:r>
+            <w:r>
+              <w:rPr>
+                <w:noProof/>
+                <w:webHidden/>
+              </w:rPr>
+              <w:instrText xml:space="preserve"> PAGEREF _Toc241316313 \h </w:instrText>
+            </w:r>
+            <w:r>
+              <w:rPr>
+                <w:noProof/>
+                <w:webHidden/>
+              </w:rPr>
+            </w:r>
+            <w:r>
+              <w:rPr>
+                <w:noProof/>
+                <w:webHidden/>
+              </w:rPr>
+              <w:fldChar w:fldCharType="separate"/>
+            </w:r>
+            <w:r>
+              <w:rPr>
+                <w:noProof/>
+                <w:webHidden/>
+              </w:rPr>
+              <w:t>35</w:t>
+            </w:r>
+            <w:r>
+              <w:rPr>
+                <w:noProof/>
+                <w:webHidden/>
+              </w:rPr>
+              <w:fldChar w:fldCharType="end"/>
+            </w:r>
+          </w:hyperlink>
+        </w:p>
+        <w:p>
+          <w:pPr>
+            <w:pStyle w:val="TDC2"/>
+            <w:tabs>
+              <w:tab w:val="right" w:leader="dot" w:pos="8828"/>
+            </w:tabs>
+            <w:rPr>
+              <w:rFonts w:eastAsiaTheme="minorEastAsia"/>
+              <w:noProof/>
+              <w:lang w:eastAsia="es-MX"/>
+            </w:rPr>
+          </w:pPr>
+          <w:hyperlink w:anchor="_Toc241316314" w:history="1">
+            <w:r>
+              <w:rPr>
+                <w:rStyle w:val="Hipervnculo"/>
+                <w:rFonts w:ascii="Open Sans" w:hAnsi="Open Sans" w:cs="Open Sans"/>
+                <w:b/>
+                <w:bCs/>
+                <w:noProof/>
+              </w:rPr>
+              <w:t>Flujo de Ejecución</w:t>
+            </w:r>
+            <w:r>
+              <w:rPr>
+                <w:noProof/>
+                <w:webHidden/>
+              </w:rPr>
+              <w:tab/>
+            </w:r>
+            <w:r>
+              <w:rPr>
+                <w:noProof/>
+                <w:webHidden/>
+              </w:rPr>
+              <w:fldChar w:fldCharType="begin"/>
+            </w:r>
+            <w:r>
+              <w:rPr>
+                <w:noProof/>
+                <w:webHidden/>
+              </w:rPr>
+              <w:instrText xml:space="preserve"> PAGEREF _Toc241316314 \h </w:instrText>
+            </w:r>
+            <w:r>
+              <w:rPr>
+                <w:noProof/>
+                <w:webHidden/>
+              </w:rPr>
+            </w:r>
+            <w:r>
+              <w:rPr>
+                <w:noProof/>
+                <w:webHidden/>
+              </w:rPr>
+              <w:fldChar w:fldCharType="separate"/>
+            </w:r>
+            <w:r>
+              <w:rPr>
+                <w:noProof/>
+                <w:webHidden/>
+              </w:rPr>
+              <w:t>37</w:t>
+            </w:r>
+            <w:r>
+              <w:rPr>
+                <w:noProof/>
+                <w:webHidden/>
+              </w:rPr>
+              <w:fldChar w:fldCharType="end"/>
+            </w:r>
+          </w:hyperlink>
+        </w:p>
+        <w:p>
+          <w:pPr>
+            <w:pStyle w:val="TDC2"/>
+            <w:tabs>
+              <w:tab w:val="right" w:leader="dot" w:pos="8828"/>
+            </w:tabs>
+            <w:rPr>
+              <w:rFonts w:eastAsiaTheme="minorEastAsia"/>
+              <w:noProof/>
+              <w:lang w:eastAsia="es-MX"/>
+            </w:rPr>
+          </w:pPr>
+          <w:hyperlink w:anchor="_Toc241316315" w:history="1">
+            <w:r>
+              <w:rPr>
+                <w:rStyle w:val="Hipervnculo"/>
+                <w:rFonts w:ascii="Open Sans" w:hAnsi="Open Sans" w:cs="Open Sans"/>
+                <w:b/>
+                <w:bCs/>
+                <w:noProof/>
+              </w:rPr>
+              <w:t>Decisiones de Diseño e Implementación Relevantes</w:t>
+            </w:r>
+            <w:r>
+              <w:rPr>
+                <w:noProof/>
+                <w:webHidden/>
+              </w:rPr>
+              <w:tab/>
+            </w:r>
+            <w:r>
+              <w:rPr>
+                <w:noProof/>
+                <w:webHidden/>
+              </w:rPr>
+              <w:fldChar w:fldCharType="begin"/>
+            </w:r>
+            <w:r>
+              <w:rPr>
+                <w:noProof/>
+                <w:webHidden/>
+              </w:rPr>
+              <w:instrText xml:space="preserve"> PAGEREF _Toc241316315 \h </w:instrText>
+            </w:r>
+            <w:r>
+              <w:rPr>
+                <w:noProof/>
+                <w:webHidden/>
+              </w:rPr>
+            </w:r>
+            <w:r>
+              <w:rPr>
+                <w:noProof/>
+                <w:webHidden/>
+              </w:rPr>
+              <w:fldChar w:fldCharType="separate"/>
+            </w:r>
+            <w:r>
+              <w:rPr>
+                <w:noProof/>
+                <w:webHidden/>
+              </w:rPr>
+              <w:t>38</w:t>
+            </w:r>
+            <w:r>
+              <w:rPr>
+                <w:noProof/>
+                <w:webHidden/>
+              </w:rPr>
+              <w:fldChar w:fldCharType="end"/>
+            </w:r>
+          </w:hyperlink>
+        </w:p>
+        <w:p>
+          <w:pPr>
+            <w:pStyle w:val="TDC2"/>
+            <w:tabs>
+              <w:tab w:val="right" w:leader="dot" w:pos="8828"/>
+            </w:tabs>
+            <w:rPr>
+              <w:rFonts w:eastAsiaTheme="minorEastAsia"/>
+              <w:noProof/>
+              <w:lang w:eastAsia="es-MX"/>
+            </w:rPr>
+          </w:pPr>
+          <w:hyperlink w:anchor="_Toc241316316" w:history="1">
+            <w:r>
+              <w:rPr>
+                <w:rStyle w:val="Hipervnculo"/>
+                <w:rFonts w:ascii="Open Sans" w:hAnsi="Open Sans" w:cs="Open Sans"/>
+                <w:b/>
+                <w:bCs/>
+                <w:noProof/>
+              </w:rPr>
+              <w:t>Correspondencia entre los requerimientos y la implementación</w:t>
+            </w:r>
+            <w:r>
+              <w:rPr>
+                <w:noProof/>
+                <w:webHidden/>
+              </w:rPr>
+              <w:tab/>
+            </w:r>
+            <w:r>
+              <w:rPr>
+                <w:noProof/>
+                <w:webHidden/>
+              </w:rPr>
+              <w:fldChar w:fldCharType="begin"/>
+            </w:r>
+            <w:r>
+              <w:rPr>
+                <w:noProof/>
+                <w:webHidden/>
+              </w:rPr>
+              <w:instrText xml:space="preserve"> PAGEREF _Toc241316316 \h </w:instrText>
+            </w:r>
+            <w:r>
+              <w:rPr>
+                <w:noProof/>
+                <w:webHidden/>
+              </w:rPr>
+            </w:r>
+            <w:r>
+              <w:rPr>
+                <w:noProof/>
+                <w:webHidden/>
+              </w:rPr>
+              <w:fldChar w:fldCharType="separate"/>
+            </w:r>
+            <w:r>
+              <w:rPr>
+                <w:noProof/>
+                <w:webHidden/>
+              </w:rPr>
+              <w:t>40</w:t>
+            </w:r>
+            <w:r>
+              <w:rPr>
+                <w:noProof/>
+                <w:webHidden/>
+              </w:rPr>
+              <w:fldChar w:fldCharType="end"/>
+            </w:r>
+          </w:hyperlink>
+        </w:p>
+        <w:p>
+          <w:pPr>
+            <w:pStyle w:val="TDC2"/>
+            <w:tabs>
+              <w:tab w:val="right" w:leader="dot" w:pos="8828"/>
+            </w:tabs>
+            <w:rPr>
+              <w:rFonts w:eastAsiaTheme="minorEastAsia"/>
+              <w:noProof/>
+              <w:lang w:eastAsia="es-MX"/>
+            </w:rPr>
+          </w:pPr>
+          <w:hyperlink w:anchor="_Toc241316317" w:history="1">
+            <w:r>
+              <w:rPr>
+                <w:rStyle w:val="Hipervnculo"/>
+                <w:rFonts w:ascii="Open Sans" w:hAnsi="Open Sans" w:cs="Open Sans"/>
+                <w:b/>
+                <w:bCs/>
+                <w:noProof/>
+              </w:rPr>
+              <w:t>Instrucciones de Uso / Ejecución</w:t>
+            </w:r>
+            <w:r>
+              <w:rPr>
+                <w:noProof/>
+                <w:webHidden/>
+              </w:rPr>
+              <w:tab/>
+            </w:r>
+            <w:r>
+              <w:rPr>
+                <w:noProof/>
+                <w:webHidden/>
+              </w:rPr>
+              <w:fldChar w:fldCharType="begin"/>
+            </w:r>
+            <w:r>
+              <w:rPr>
+                <w:noProof/>
+                <w:webHidden/>
+              </w:rPr>
+              <w:instrText xml:space="preserve"> PAGEREF _Toc241316317 \h </w:instrText>
+            </w:r>
+            <w:r>
+              <w:rPr>
+                <w:noProof/>
+                <w:webHidden/>
+              </w:rPr>
+            </w:r>
+            <w:r>
+              <w:rPr>
+                <w:noProof/>
+                <w:webHidden/>
+              </w:rPr>
+              <w:fldChar w:fldCharType="separate"/>
+            </w:r>
+            <w:r>
+              <w:rPr>
+                <w:noProof/>
+                <w:webHidden/>
+              </w:rPr>
+              <w:t>41</w:t>
             </w:r>
             <w:r>
               <w:rPr>
@@ -658,7 +1394,7 @@
               <w:lang w:eastAsia="es-MX"/>
             </w:rPr>
           </w:pPr>
-          <w:hyperlink w:anchor="_Toc241309499" w:history="1">
+          <w:hyperlink w:anchor="_Toc241316318" w:history="1">
             <w:r>
               <w:rPr>
                 <w:rStyle w:val="Hipervnculo"/>
@@ -688,7 +1424,7 @@
                 <w:noProof/>
                 <w:webHidden/>
               </w:rPr>
-              <w:instrText xml:space="preserve"> PAGEREF _Toc241309499 \h </w:instrText>
+              <w:instrText xml:space="preserve"> PAGEREF _Toc241316318 \h </w:instrText>
             </w:r>
             <w:r>
               <w:rPr>
@@ -708,7 +1444,7 @@
                 <w:noProof/>
                 <w:webHidden/>
               </w:rPr>
-              <w:t>9</w:t>
+              <w:t>43</w:t>
             </w:r>
             <w:r>
               <w:rPr>
@@ -731,7 +1467,7 @@
               <w:lang w:eastAsia="es-MX"/>
             </w:rPr>
           </w:pPr>
-          <w:hyperlink w:anchor="_Toc241309500" w:history="1">
+          <w:hyperlink w:anchor="_Toc241316319" w:history="1">
             <w:r>
               <w:rPr>
                 <w:rStyle w:val="Hipervnculo"/>
@@ -761,7 +1497,7 @@
                 <w:noProof/>
                 <w:webHidden/>
               </w:rPr>
-              <w:instrText xml:space="preserve"> PAGEREF _Toc241309500 \h </w:instrText>
+              <w:instrText xml:space="preserve"> PAGEREF _Toc241316319 \h </w:instrText>
             </w:r>
             <w:r>
               <w:rPr>
@@ -781,7 +1517,7 @@
                 <w:noProof/>
                 <w:webHidden/>
               </w:rPr>
-              <w:t>10</w:t>
+              <w:t>75</w:t>
             </w:r>
             <w:r>
               <w:rPr>
@@ -804,7 +1540,7 @@
               <w:lang w:eastAsia="es-MX"/>
             </w:rPr>
           </w:pPr>
-          <w:hyperlink w:anchor="_Toc241309501" w:history="1">
+          <w:hyperlink w:anchor="_Toc241316320" w:history="1">
             <w:r>
               <w:rPr>
                 <w:rStyle w:val="Hipervnculo"/>
@@ -834,7 +1570,7 @@
                 <w:noProof/>
                 <w:webHidden/>
               </w:rPr>
-              <w:instrText xml:space="preserve"> PAGEREF _Toc241309501 \h </w:instrText>
+              <w:instrText xml:space="preserve"> PAGEREF _Toc241316320 \h </w:instrText>
             </w:r>
             <w:r>
               <w:rPr>
@@ -854,7 +1590,7 @@
                 <w:noProof/>
                 <w:webHidden/>
               </w:rPr>
-              <w:t>12</w:t>
+              <w:t>77</w:t>
             </w:r>
             <w:r>
               <w:rPr>
@@ -913,7 +1649,7 @@
           <w:szCs w:val="32"/>
         </w:rPr>
       </w:pPr>
-      <w:bookmarkStart w:id="1" w:name="_Toc241309492"/>
+      <w:bookmarkStart w:id="1" w:name="_Toc241316301"/>
       <w:r>
         <w:rPr>
           <w:rFonts w:ascii="Open Sans" w:eastAsiaTheme="minorHAnsi" w:hAnsi="Open Sans" w:cs="Open Sans"/>
@@ -1078,7 +1814,7 @@
       <w:bookmarkStart w:id="3" w:name="_Toc239195290"/>
       <w:bookmarkStart w:id="4" w:name="_Toc239453191"/>
       <w:bookmarkStart w:id="5" w:name="_Toc241003977"/>
-      <w:bookmarkStart w:id="6" w:name="_Toc241309493"/>
+      <w:bookmarkStart w:id="6" w:name="_Toc241316302"/>
       <w:r>
         <w:rPr>
           <w:rFonts w:ascii="Open Sans" w:eastAsiaTheme="minorHAnsi" w:hAnsi="Open Sans" w:cs="Open Sans"/>
@@ -1212,7 +1948,7 @@
         </w:rPr>
       </w:pPr>
       <w:bookmarkStart w:id="10" w:name="_Toc241003978"/>
-      <w:bookmarkStart w:id="11" w:name="_Toc241309494"/>
+      <w:bookmarkStart w:id="11" w:name="_Toc241316303"/>
       <w:r>
         <w:rPr>
           <w:rFonts w:ascii="Open Sans" w:eastAsiaTheme="minorHAnsi" w:hAnsi="Open Sans" w:cs="Open Sans"/>
@@ -1714,7 +2450,7 @@
         </w:rPr>
       </w:pPr>
       <w:bookmarkStart w:id="15" w:name="_Toc241003979"/>
-      <w:bookmarkStart w:id="16" w:name="_Toc241309495"/>
+      <w:bookmarkStart w:id="16" w:name="_Toc241316304"/>
       <w:r>
         <w:rPr>
           <w:rFonts w:ascii="Open Sans" w:eastAsiaTheme="minorHAnsi" w:hAnsi="Open Sans" w:cs="Open Sans"/>
@@ -1780,7 +2516,7 @@
         </w:rPr>
       </w:pPr>
       <w:bookmarkStart w:id="17" w:name="_Toc241003980"/>
-      <w:bookmarkStart w:id="18" w:name="_Toc241309496"/>
+      <w:bookmarkStart w:id="18" w:name="_Toc241316305"/>
       <w:r>
         <w:rPr>
           <w:rFonts w:ascii="Open Sans" w:eastAsiaTheme="minorHAnsi" w:hAnsi="Open Sans" w:cs="Open Sans"/>
@@ -2457,7 +3193,7 @@
           <w:szCs w:val="28"/>
         </w:rPr>
       </w:pPr>
-      <w:bookmarkStart w:id="19" w:name="_Toc241309497"/>
+      <w:bookmarkStart w:id="19" w:name="_Toc241316306"/>
       <w:r>
         <w:rPr>
           <w:rFonts w:ascii="Open Sans" w:eastAsiaTheme="minorHAnsi" w:hAnsi="Open Sans" w:cs="Open Sans"/>
@@ -3235,7 +3971,7 @@
           <w:szCs w:val="28"/>
         </w:rPr>
       </w:pPr>
-      <w:bookmarkStart w:id="20" w:name="_Toc241309498"/>
+      <w:bookmarkStart w:id="20" w:name="_Toc241316307"/>
       <w:r>
         <w:rPr>
           <w:rFonts w:ascii="Open Sans" w:eastAsiaTheme="minorHAnsi" w:hAnsi="Open Sans" w:cs="Open Sans"/>
@@ -3647,6 +4383,7 @@
           <w:szCs w:val="28"/>
         </w:rPr>
       </w:pPr>
+      <w:bookmarkStart w:id="21" w:name="_Toc241316308"/>
       <w:r>
         <w:rPr>
           <w:rFonts w:ascii="Open Sans" w:eastAsiaTheme="minorHAnsi" w:hAnsi="Open Sans" w:cs="Open Sans"/>
@@ -3658,6 +4395,7 @@
         </w:rPr>
         <w:t>Estructura del Código</w:t>
       </w:r>
+      <w:bookmarkEnd w:id="21"/>
     </w:p>
     <w:p>
       <w:pPr>
@@ -4701,6 +5439,7 @@
           <w:szCs w:val="28"/>
         </w:rPr>
       </w:pPr>
+      <w:bookmarkStart w:id="22" w:name="_Toc241316309"/>
       <w:r>
         <w:rPr>
           <w:rFonts w:ascii="Open Sans" w:eastAsiaTheme="minorHAnsi" w:hAnsi="Open Sans" w:cs="Open Sans"/>
@@ -4712,6 +5451,7 @@
         </w:rPr>
         <w:t>Tabla de clases y responsabilidades</w:t>
       </w:r>
+      <w:bookmarkEnd w:id="22"/>
     </w:p>
     <w:tbl>
       <w:tblPr>
@@ -6009,6 +6749,7 @@
           <w:szCs w:val="28"/>
         </w:rPr>
       </w:pPr>
+      <w:bookmarkStart w:id="23" w:name="_Toc241316310"/>
       <w:r>
         <w:rPr>
           <w:rFonts w:ascii="Open Sans" w:eastAsiaTheme="minorHAnsi" w:hAnsi="Open Sans" w:cs="Open Sans"/>
@@ -6020,6 +6761,7 @@
         </w:rPr>
         <w:t>Fichas técnicas de las clases del sistema</w:t>
       </w:r>
+      <w:bookmarkEnd w:id="23"/>
     </w:p>
     <w:p>
       <w:pPr>
@@ -12433,6 +13175,7 @@
           <w:szCs w:val="28"/>
         </w:rPr>
       </w:pPr>
+      <w:bookmarkStart w:id="24" w:name="_Toc241316311"/>
       <w:r>
         <w:rPr>
           <w:rFonts w:ascii="Open Sans" w:eastAsiaTheme="minorHAnsi" w:hAnsi="Open Sans" w:cs="Open Sans"/>
@@ -12444,6 +13187,7 @@
         </w:rPr>
         <w:t>Relación de las clases con el patrón MVC</w:t>
       </w:r>
+      <w:bookmarkEnd w:id="24"/>
     </w:p>
     <w:p>
       <w:pPr>
@@ -13136,6 +13880,7 @@
           <w:szCs w:val="28"/>
         </w:rPr>
       </w:pPr>
+      <w:bookmarkStart w:id="25" w:name="_Toc241316312"/>
       <w:r>
         <w:rPr>
           <w:rFonts w:ascii="Open Sans" w:eastAsiaTheme="minorHAnsi" w:hAnsi="Open Sans" w:cs="Open Sans"/>
@@ -13147,6 +13892,7 @@
         </w:rPr>
         <w:t>Explicación Detallada de Cada Componente</w:t>
       </w:r>
+      <w:bookmarkEnd w:id="25"/>
     </w:p>
     <w:p>
       <w:pPr>
@@ -21908,6 +22654,7 @@
           <w:szCs w:val="28"/>
         </w:rPr>
       </w:pPr>
+      <w:bookmarkStart w:id="26" w:name="_Toc241316313"/>
       <w:r>
         <w:rPr>
           <w:rFonts w:ascii="Open Sans" w:eastAsiaTheme="minorHAnsi" w:hAnsi="Open Sans" w:cs="Open Sans"/>
@@ -21919,6 +22666,7 @@
         </w:rPr>
         <w:t>Complejidad de las principales operaciones</w:t>
       </w:r>
+      <w:bookmarkEnd w:id="26"/>
     </w:p>
     <w:p>
       <w:r>
@@ -23145,6 +23893,7 @@
           <w:szCs w:val="28"/>
         </w:rPr>
       </w:pPr>
+      <w:bookmarkStart w:id="27" w:name="_Toc241316314"/>
       <w:r>
         <w:rPr>
           <w:rFonts w:ascii="Open Sans" w:eastAsiaTheme="minorHAnsi" w:hAnsi="Open Sans" w:cs="Open Sans"/>
@@ -23156,6 +23905,7 @@
         </w:rPr>
         <w:t>Flujo de Ejecución</w:t>
       </w:r>
+      <w:bookmarkEnd w:id="27"/>
     </w:p>
     <w:p>
       <w:pPr>
@@ -23431,6 +24181,7 @@
           <w:szCs w:val="28"/>
         </w:rPr>
       </w:pPr>
+      <w:bookmarkStart w:id="28" w:name="_Toc241316315"/>
       <w:r>
         <w:rPr>
           <w:rFonts w:ascii="Open Sans" w:eastAsiaTheme="minorHAnsi" w:hAnsi="Open Sans" w:cs="Open Sans"/>
@@ -23442,6 +24193,7 @@
         </w:rPr>
         <w:t>Decisiones de Diseño e Implementación Relevantes</w:t>
       </w:r>
+      <w:bookmarkEnd w:id="28"/>
     </w:p>
     <w:p>
       <w:pPr>
@@ -23781,6 +24533,7 @@
           <w:szCs w:val="24"/>
         </w:rPr>
       </w:pPr>
+      <w:bookmarkStart w:id="29" w:name="_Toc241316316"/>
       <w:r>
         <w:rPr>
           <w:rFonts w:ascii="Open Sans" w:eastAsiaTheme="minorHAnsi" w:hAnsi="Open Sans" w:cs="Open Sans"/>
@@ -23792,6 +24545,7 @@
         </w:rPr>
         <w:t>Correspondencia entre los requerimientos y la implementación</w:t>
       </w:r>
+      <w:bookmarkEnd w:id="29"/>
     </w:p>
     <w:tbl>
       <w:tblPr>
@@ -24676,6 +25430,7 @@
           <w:szCs w:val="28"/>
         </w:rPr>
       </w:pPr>
+      <w:bookmarkStart w:id="30" w:name="_Toc241316317"/>
       <w:r>
         <w:rPr>
           <w:rFonts w:ascii="Open Sans" w:eastAsiaTheme="minorHAnsi" w:hAnsi="Open Sans" w:cs="Open Sans"/>
@@ -24687,6 +25442,7 @@
         </w:rPr>
         <w:t>Instrucciones de Uso / Ejecución</w:t>
       </w:r>
+      <w:bookmarkEnd w:id="30"/>
     </w:p>
     <w:p>
       <w:pPr>
@@ -25620,8 +26376,8 @@
           <w:szCs w:val="32"/>
         </w:rPr>
       </w:pPr>
-      <w:bookmarkStart w:id="21" w:name="_Toc241003991"/>
-      <w:bookmarkStart w:id="22" w:name="_Toc241309499"/>
+      <w:bookmarkStart w:id="31" w:name="_Toc241003991"/>
+      <w:bookmarkStart w:id="32" w:name="_Toc241316318"/>
       <w:r>
         <w:rPr>
           <w:rFonts w:ascii="Open Sans" w:eastAsiaTheme="minorHAnsi" w:hAnsi="Open Sans" w:cs="Open Sans"/>
@@ -25634,8 +26390,8 @@
         <w:lastRenderedPageBreak/>
         <w:t>Documento de Prueba de Ejecución</w:t>
       </w:r>
-      <w:bookmarkEnd w:id="21"/>
-      <w:bookmarkEnd w:id="22"/>
+      <w:bookmarkEnd w:id="31"/>
+      <w:bookmarkEnd w:id="32"/>
     </w:p>
     <w:p>
       <w:pPr>
@@ -34151,8 +34907,8 @@
           <w:szCs w:val="32"/>
         </w:rPr>
       </w:pPr>
-      <w:bookmarkStart w:id="23" w:name="_Toc241003992"/>
-      <w:bookmarkStart w:id="24" w:name="_Toc241309500"/>
+      <w:bookmarkStart w:id="33" w:name="_Toc241003992"/>
+      <w:bookmarkStart w:id="34" w:name="_Toc241316319"/>
       <w:r>
         <w:rPr>
           <w:rFonts w:ascii="Open Sans" w:eastAsiaTheme="minorHAnsi" w:hAnsi="Open Sans" w:cs="Open Sans"/>
@@ -34164,21 +34920,21 @@
         </w:rPr>
         <w:t>Conclusión</w:t>
       </w:r>
-      <w:bookmarkEnd w:id="23"/>
-      <w:bookmarkEnd w:id="24"/>
-    </w:p>
-    <w:p>
-      <w:pPr>
-        <w:jc w:val="both"/>
-        <w:rPr>
-          <w:rFonts w:ascii="Open Sans" w:hAnsi="Open Sans" w:cs="Open Sans"/>
-          <w:sz w:val="22"/>
-          <w:szCs w:val="22"/>
-        </w:rPr>
-      </w:pPr>
-      <w:bookmarkStart w:id="25" w:name="_Toc238245601"/>
-      <w:bookmarkStart w:id="26" w:name="_Toc239195295"/>
-      <w:bookmarkStart w:id="27" w:name="_Toc239453196"/>
+      <w:bookmarkEnd w:id="33"/>
+      <w:bookmarkEnd w:id="34"/>
+    </w:p>
+    <w:p>
+      <w:pPr>
+        <w:jc w:val="both"/>
+        <w:rPr>
+          <w:rFonts w:ascii="Open Sans" w:hAnsi="Open Sans" w:cs="Open Sans"/>
+          <w:sz w:val="22"/>
+          <w:szCs w:val="22"/>
+        </w:rPr>
+      </w:pPr>
+      <w:bookmarkStart w:id="35" w:name="_Toc238245601"/>
+      <w:bookmarkStart w:id="36" w:name="_Toc239195295"/>
+      <w:bookmarkStart w:id="37" w:name="_Toc239453196"/>
       <w:r>
         <w:rPr>
           <w:rFonts w:ascii="Open Sans" w:hAnsi="Open Sans" w:cs="Open Sans"/>
@@ -34366,8 +35122,8 @@
           <w:szCs w:val="32"/>
         </w:rPr>
       </w:pPr>
-      <w:bookmarkStart w:id="28" w:name="_Toc241003993"/>
-      <w:bookmarkStart w:id="29" w:name="_Toc241309501"/>
+      <w:bookmarkStart w:id="38" w:name="_Toc241003993"/>
+      <w:bookmarkStart w:id="39" w:name="_Toc241316320"/>
       <w:r>
         <w:rPr>
           <w:rFonts w:ascii="Open Sans" w:eastAsiaTheme="minorHAnsi" w:hAnsi="Open Sans" w:cs="Open Sans"/>
@@ -34379,11 +35135,11 @@
         </w:rPr>
         <w:t>Referencias Bibliográficas</w:t>
       </w:r>
-      <w:bookmarkEnd w:id="25"/>
-      <w:bookmarkEnd w:id="26"/>
-      <w:bookmarkEnd w:id="27"/>
-      <w:bookmarkEnd w:id="28"/>
-      <w:bookmarkEnd w:id="29"/>
+      <w:bookmarkEnd w:id="35"/>
+      <w:bookmarkEnd w:id="36"/>
+      <w:bookmarkEnd w:id="37"/>
+      <w:bookmarkEnd w:id="38"/>
+      <w:bookmarkEnd w:id="39"/>
     </w:p>
     <w:p>
       <w:pPr>
@@ -34974,119 +35730,6 @@
     </w:lvl>
   </w:abstractNum>
   <w:abstractNum w:abstractNumId="2" w15:restartNumberingAfterBreak="0">
-    <w:nsid w:val="049B5288"/>
-    <w:multiLevelType w:val="multilevel"/>
-    <w:tmpl w:val="F03CAFF6"/>
-    <w:lvl w:ilvl="0">
-      <w:start w:val="1"/>
-      <w:numFmt w:val="decimal"/>
-      <w:lvlText w:val="%1."/>
-      <w:lvlJc w:val="left"/>
-      <w:pPr>
-        <w:tabs>
-          <w:tab w:val="num" w:pos="720"/>
-        </w:tabs>
-        <w:ind w:left="720" w:hanging="360"/>
-      </w:pPr>
-    </w:lvl>
-    <w:lvl w:ilvl="1" w:tentative="1">
-      <w:start w:val="1"/>
-      <w:numFmt w:val="decimal"/>
-      <w:lvlText w:val="%2."/>
-      <w:lvlJc w:val="left"/>
-      <w:pPr>
-        <w:tabs>
-          <w:tab w:val="num" w:pos="1440"/>
-        </w:tabs>
-        <w:ind w:left="1440" w:hanging="360"/>
-      </w:pPr>
-    </w:lvl>
-    <w:lvl w:ilvl="2" w:tentative="1">
-      <w:start w:val="1"/>
-      <w:numFmt w:val="decimal"/>
-      <w:lvlText w:val="%3."/>
-      <w:lvlJc w:val="left"/>
-      <w:pPr>
-        <w:tabs>
-          <w:tab w:val="num" w:pos="2160"/>
-        </w:tabs>
-        <w:ind w:left="2160" w:hanging="360"/>
-      </w:pPr>
-    </w:lvl>
-    <w:lvl w:ilvl="3" w:tentative="1">
-      <w:start w:val="1"/>
-      <w:numFmt w:val="decimal"/>
-      <w:lvlText w:val="%4."/>
-      <w:lvlJc w:val="left"/>
-      <w:pPr>
-        <w:tabs>
-          <w:tab w:val="num" w:pos="2880"/>
-        </w:tabs>
-        <w:ind w:left="2880" w:hanging="360"/>
-      </w:pPr>
-    </w:lvl>
-    <w:lvl w:ilvl="4" w:tentative="1">
-      <w:start w:val="1"/>
-      <w:numFmt w:val="decimal"/>
-      <w:lvlText w:val="%5."/>
-      <w:lvlJc w:val="left"/>
-      <w:pPr>
-        <w:tabs>
-          <w:tab w:val="num" w:pos="3600"/>
-        </w:tabs>
-        <w:ind w:left="3600" w:hanging="360"/>
-      </w:pPr>
-    </w:lvl>
-    <w:lvl w:ilvl="5" w:tentative="1">
-      <w:start w:val="1"/>
-      <w:numFmt w:val="decimal"/>
-      <w:lvlText w:val="%6."/>
-      <w:lvlJc w:val="left"/>
-      <w:pPr>
-        <w:tabs>
-          <w:tab w:val="num" w:pos="4320"/>
-        </w:tabs>
-        <w:ind w:left="4320" w:hanging="360"/>
-      </w:pPr>
-    </w:lvl>
-    <w:lvl w:ilvl="6" w:tentative="1">
-      <w:start w:val="1"/>
-      <w:numFmt w:val="decimal"/>
-      <w:lvlText w:val="%7."/>
-      <w:lvlJc w:val="left"/>
-      <w:pPr>
-        <w:tabs>
-          <w:tab w:val="num" w:pos="5040"/>
-        </w:tabs>
-        <w:ind w:left="5040" w:hanging="360"/>
-      </w:pPr>
-    </w:lvl>
-    <w:lvl w:ilvl="7" w:tentative="1">
-      <w:start w:val="1"/>
-      <w:numFmt w:val="decimal"/>
-      <w:lvlText w:val="%8."/>
-      <w:lvlJc w:val="left"/>
-      <w:pPr>
-        <w:tabs>
-          <w:tab w:val="num" w:pos="5760"/>
-        </w:tabs>
-        <w:ind w:left="5760" w:hanging="360"/>
-      </w:pPr>
-    </w:lvl>
-    <w:lvl w:ilvl="8" w:tentative="1">
-      <w:start w:val="1"/>
-      <w:numFmt w:val="decimal"/>
-      <w:lvlText w:val="%9."/>
-      <w:lvlJc w:val="left"/>
-      <w:pPr>
-        <w:tabs>
-          <w:tab w:val="num" w:pos="6480"/>
-        </w:tabs>
-        <w:ind w:left="6480" w:hanging="360"/>
-      </w:pPr>
-    </w:lvl>
-  </w:abstractNum>
-  <w:abstractNum w:abstractNumId="3" w15:restartNumberingAfterBreak="0">
     <w:nsid w:val="0B487752"/>
     <w:multiLevelType w:val="multilevel"/>
     <w:tmpl w:val="C5189E74"/>
@@ -35199,7 +35842,7 @@
       </w:pPr>
     </w:lvl>
   </w:abstractNum>
-  <w:abstractNum w:abstractNumId="4" w15:restartNumberingAfterBreak="0">
+  <w:abstractNum w:abstractNumId="3" w15:restartNumberingAfterBreak="0">
     <w:nsid w:val="0F9A348D"/>
     <w:multiLevelType w:val="multilevel"/>
     <w:tmpl w:val="6BA2B562"/>
@@ -35348,7 +35991,7 @@
       </w:rPr>
     </w:lvl>
   </w:abstractNum>
-  <w:abstractNum w:abstractNumId="5" w15:restartNumberingAfterBreak="0">
+  <w:abstractNum w:abstractNumId="4" w15:restartNumberingAfterBreak="0">
     <w:nsid w:val="110F2306"/>
     <w:multiLevelType w:val="multilevel"/>
     <w:tmpl w:val="8CA65196"/>
@@ -35461,7 +36104,7 @@
       </w:pPr>
     </w:lvl>
   </w:abstractNum>
-  <w:abstractNum w:abstractNumId="6" w15:restartNumberingAfterBreak="0">
+  <w:abstractNum w:abstractNumId="5" w15:restartNumberingAfterBreak="0">
     <w:nsid w:val="145C33CD"/>
     <w:multiLevelType w:val="multilevel"/>
     <w:tmpl w:val="02DAA30E"/>
@@ -35574,7 +36217,7 @@
       </w:pPr>
     </w:lvl>
   </w:abstractNum>
-  <w:abstractNum w:abstractNumId="7" w15:restartNumberingAfterBreak="0">
+  <w:abstractNum w:abstractNumId="6" w15:restartNumberingAfterBreak="0">
     <w:nsid w:val="14720099"/>
     <w:multiLevelType w:val="multilevel"/>
     <w:tmpl w:val="27A67E3A"/>
@@ -35723,233 +36366,7 @@
       </w:rPr>
     </w:lvl>
   </w:abstractNum>
-  <w:abstractNum w:abstractNumId="8" w15:restartNumberingAfterBreak="0">
-    <w:nsid w:val="14B80261"/>
-    <w:multiLevelType w:val="multilevel"/>
-    <w:tmpl w:val="D97AA118"/>
-    <w:lvl w:ilvl="0">
-      <w:start w:val="1"/>
-      <w:numFmt w:val="decimal"/>
-      <w:lvlText w:val="%1."/>
-      <w:lvlJc w:val="left"/>
-      <w:pPr>
-        <w:tabs>
-          <w:tab w:val="num" w:pos="720"/>
-        </w:tabs>
-        <w:ind w:left="720" w:hanging="360"/>
-      </w:pPr>
-    </w:lvl>
-    <w:lvl w:ilvl="1" w:tentative="1">
-      <w:start w:val="1"/>
-      <w:numFmt w:val="decimal"/>
-      <w:lvlText w:val="%2."/>
-      <w:lvlJc w:val="left"/>
-      <w:pPr>
-        <w:tabs>
-          <w:tab w:val="num" w:pos="1440"/>
-        </w:tabs>
-        <w:ind w:left="1440" w:hanging="360"/>
-      </w:pPr>
-    </w:lvl>
-    <w:lvl w:ilvl="2" w:tentative="1">
-      <w:start w:val="1"/>
-      <w:numFmt w:val="decimal"/>
-      <w:lvlText w:val="%3."/>
-      <w:lvlJc w:val="left"/>
-      <w:pPr>
-        <w:tabs>
-          <w:tab w:val="num" w:pos="2160"/>
-        </w:tabs>
-        <w:ind w:left="2160" w:hanging="360"/>
-      </w:pPr>
-    </w:lvl>
-    <w:lvl w:ilvl="3" w:tentative="1">
-      <w:start w:val="1"/>
-      <w:numFmt w:val="decimal"/>
-      <w:lvlText w:val="%4."/>
-      <w:lvlJc w:val="left"/>
-      <w:pPr>
-        <w:tabs>
-          <w:tab w:val="num" w:pos="2880"/>
-        </w:tabs>
-        <w:ind w:left="2880" w:hanging="360"/>
-      </w:pPr>
-    </w:lvl>
-    <w:lvl w:ilvl="4" w:tentative="1">
-      <w:start w:val="1"/>
-      <w:numFmt w:val="decimal"/>
-      <w:lvlText w:val="%5."/>
-      <w:lvlJc w:val="left"/>
-      <w:pPr>
-        <w:tabs>
-          <w:tab w:val="num" w:pos="3600"/>
-        </w:tabs>
-        <w:ind w:left="3600" w:hanging="360"/>
-      </w:pPr>
-    </w:lvl>
-    <w:lvl w:ilvl="5" w:tentative="1">
-      <w:start w:val="1"/>
-      <w:numFmt w:val="decimal"/>
-      <w:lvlText w:val="%6."/>
-      <w:lvlJc w:val="left"/>
-      <w:pPr>
-        <w:tabs>
-          <w:tab w:val="num" w:pos="4320"/>
-        </w:tabs>
-        <w:ind w:left="4320" w:hanging="360"/>
-      </w:pPr>
-    </w:lvl>
-    <w:lvl w:ilvl="6" w:tentative="1">
-      <w:start w:val="1"/>
-      <w:numFmt w:val="decimal"/>
-      <w:lvlText w:val="%7."/>
-      <w:lvlJc w:val="left"/>
-      <w:pPr>
-        <w:tabs>
-          <w:tab w:val="num" w:pos="5040"/>
-        </w:tabs>
-        <w:ind w:left="5040" w:hanging="360"/>
-      </w:pPr>
-    </w:lvl>
-    <w:lvl w:ilvl="7" w:tentative="1">
-      <w:start w:val="1"/>
-      <w:numFmt w:val="decimal"/>
-      <w:lvlText w:val="%8."/>
-      <w:lvlJc w:val="left"/>
-      <w:pPr>
-        <w:tabs>
-          <w:tab w:val="num" w:pos="5760"/>
-        </w:tabs>
-        <w:ind w:left="5760" w:hanging="360"/>
-      </w:pPr>
-    </w:lvl>
-    <w:lvl w:ilvl="8" w:tentative="1">
-      <w:start w:val="1"/>
-      <w:numFmt w:val="decimal"/>
-      <w:lvlText w:val="%9."/>
-      <w:lvlJc w:val="left"/>
-      <w:pPr>
-        <w:tabs>
-          <w:tab w:val="num" w:pos="6480"/>
-        </w:tabs>
-        <w:ind w:left="6480" w:hanging="360"/>
-      </w:pPr>
-    </w:lvl>
-  </w:abstractNum>
-  <w:abstractNum w:abstractNumId="9" w15:restartNumberingAfterBreak="0">
-    <w:nsid w:val="16253DCD"/>
-    <w:multiLevelType w:val="multilevel"/>
-    <w:tmpl w:val="3B28CC0E"/>
-    <w:lvl w:ilvl="0">
-      <w:start w:val="1"/>
-      <w:numFmt w:val="decimal"/>
-      <w:lvlText w:val="%1."/>
-      <w:lvlJc w:val="left"/>
-      <w:pPr>
-        <w:tabs>
-          <w:tab w:val="num" w:pos="720"/>
-        </w:tabs>
-        <w:ind w:left="720" w:hanging="360"/>
-      </w:pPr>
-    </w:lvl>
-    <w:lvl w:ilvl="1" w:tentative="1">
-      <w:start w:val="1"/>
-      <w:numFmt w:val="decimal"/>
-      <w:lvlText w:val="%2."/>
-      <w:lvlJc w:val="left"/>
-      <w:pPr>
-        <w:tabs>
-          <w:tab w:val="num" w:pos="1440"/>
-        </w:tabs>
-        <w:ind w:left="1440" w:hanging="360"/>
-      </w:pPr>
-    </w:lvl>
-    <w:lvl w:ilvl="2" w:tentative="1">
-      <w:start w:val="1"/>
-      <w:numFmt w:val="decimal"/>
-      <w:lvlText w:val="%3."/>
-      <w:lvlJc w:val="left"/>
-      <w:pPr>
-        <w:tabs>
-          <w:tab w:val="num" w:pos="2160"/>
-        </w:tabs>
-        <w:ind w:left="2160" w:hanging="360"/>
-      </w:pPr>
-    </w:lvl>
-    <w:lvl w:ilvl="3" w:tentative="1">
-      <w:start w:val="1"/>
-      <w:numFmt w:val="decimal"/>
-      <w:lvlText w:val="%4."/>
-      <w:lvlJc w:val="left"/>
-      <w:pPr>
-        <w:tabs>
-          <w:tab w:val="num" w:pos="2880"/>
-        </w:tabs>
-        <w:ind w:left="2880" w:hanging="360"/>
-      </w:pPr>
-    </w:lvl>
-    <w:lvl w:ilvl="4" w:tentative="1">
-      <w:start w:val="1"/>
-      <w:numFmt w:val="decimal"/>
-      <w:lvlText w:val="%5."/>
-      <w:lvlJc w:val="left"/>
-      <w:pPr>
-        <w:tabs>
-          <w:tab w:val="num" w:pos="3600"/>
-        </w:tabs>
-        <w:ind w:left="3600" w:hanging="360"/>
-      </w:pPr>
-    </w:lvl>
-    <w:lvl w:ilvl="5" w:tentative="1">
-      <w:start w:val="1"/>
-      <w:numFmt w:val="decimal"/>
-      <w:lvlText w:val="%6."/>
-      <w:lvlJc w:val="left"/>
-      <w:pPr>
-        <w:tabs>
-          <w:tab w:val="num" w:pos="4320"/>
-        </w:tabs>
-        <w:ind w:left="4320" w:hanging="360"/>
-      </w:pPr>
-    </w:lvl>
-    <w:lvl w:ilvl="6" w:tentative="1">
-      <w:start w:val="1"/>
-      <w:numFmt w:val="decimal"/>
-      <w:lvlText w:val="%7."/>
-      <w:lvlJc w:val="left"/>
-      <w:pPr>
-        <w:tabs>
-          <w:tab w:val="num" w:pos="5040"/>
-        </w:tabs>
-        <w:ind w:left="5040" w:hanging="360"/>
-      </w:pPr>
-    </w:lvl>
-    <w:lvl w:ilvl="7" w:tentative="1">
-      <w:start w:val="1"/>
-      <w:numFmt w:val="decimal"/>
-      <w:lvlText w:val="%8."/>
-      <w:lvlJc w:val="left"/>
-      <w:pPr>
-        <w:tabs>
-          <w:tab w:val="num" w:pos="5760"/>
-        </w:tabs>
-        <w:ind w:left="5760" w:hanging="360"/>
-      </w:pPr>
-    </w:lvl>
-    <w:lvl w:ilvl="8" w:tentative="1">
-      <w:start w:val="1"/>
-      <w:numFmt w:val="decimal"/>
-      <w:lvlText w:val="%9."/>
-      <w:lvlJc w:val="left"/>
-      <w:pPr>
-        <w:tabs>
-          <w:tab w:val="num" w:pos="6480"/>
-        </w:tabs>
-        <w:ind w:left="6480" w:hanging="360"/>
-      </w:pPr>
-    </w:lvl>
-  </w:abstractNum>
-  <w:abstractNum w:abstractNumId="10" w15:restartNumberingAfterBreak="0">
+  <w:abstractNum w:abstractNumId="7" w15:restartNumberingAfterBreak="0">
     <w:nsid w:val="17177DB1"/>
     <w:multiLevelType w:val="multilevel"/>
     <w:tmpl w:val="A6C41D1E"/>
@@ -36098,7 +36515,7 @@
       </w:rPr>
     </w:lvl>
   </w:abstractNum>
-  <w:abstractNum w:abstractNumId="11" w15:restartNumberingAfterBreak="0">
+  <w:abstractNum w:abstractNumId="8" w15:restartNumberingAfterBreak="0">
     <w:nsid w:val="1C546D12"/>
     <w:multiLevelType w:val="multilevel"/>
     <w:tmpl w:val="28AA5122"/>
@@ -36247,7 +36664,7 @@
       </w:rPr>
     </w:lvl>
   </w:abstractNum>
-  <w:abstractNum w:abstractNumId="12" w15:restartNumberingAfterBreak="0">
+  <w:abstractNum w:abstractNumId="9" w15:restartNumberingAfterBreak="0">
     <w:nsid w:val="1D782BCE"/>
     <w:multiLevelType w:val="multilevel"/>
     <w:tmpl w:val="802810C8"/>
@@ -36396,7 +36813,7 @@
       </w:rPr>
     </w:lvl>
   </w:abstractNum>
-  <w:abstractNum w:abstractNumId="13" w15:restartNumberingAfterBreak="0">
+  <w:abstractNum w:abstractNumId="10" w15:restartNumberingAfterBreak="0">
     <w:nsid w:val="219D2FB6"/>
     <w:multiLevelType w:val="multilevel"/>
     <w:tmpl w:val="411E7AA0"/>
@@ -36509,120 +36926,7 @@
       </w:pPr>
     </w:lvl>
   </w:abstractNum>
-  <w:abstractNum w:abstractNumId="14" w15:restartNumberingAfterBreak="0">
-    <w:nsid w:val="23DC58AE"/>
-    <w:multiLevelType w:val="multilevel"/>
-    <w:tmpl w:val="B9B6ED60"/>
-    <w:lvl w:ilvl="0">
-      <w:start w:val="1"/>
-      <w:numFmt w:val="decimal"/>
-      <w:lvlText w:val="%1."/>
-      <w:lvlJc w:val="left"/>
-      <w:pPr>
-        <w:tabs>
-          <w:tab w:val="num" w:pos="720"/>
-        </w:tabs>
-        <w:ind w:left="720" w:hanging="360"/>
-      </w:pPr>
-    </w:lvl>
-    <w:lvl w:ilvl="1" w:tentative="1">
-      <w:start w:val="1"/>
-      <w:numFmt w:val="decimal"/>
-      <w:lvlText w:val="%2."/>
-      <w:lvlJc w:val="left"/>
-      <w:pPr>
-        <w:tabs>
-          <w:tab w:val="num" w:pos="1440"/>
-        </w:tabs>
-        <w:ind w:left="1440" w:hanging="360"/>
-      </w:pPr>
-    </w:lvl>
-    <w:lvl w:ilvl="2" w:tentative="1">
-      <w:start w:val="1"/>
-      <w:numFmt w:val="decimal"/>
-      <w:lvlText w:val="%3."/>
-      <w:lvlJc w:val="left"/>
-      <w:pPr>
-        <w:tabs>
-          <w:tab w:val="num" w:pos="2160"/>
-        </w:tabs>
-        <w:ind w:left="2160" w:hanging="360"/>
-      </w:pPr>
-    </w:lvl>
-    <w:lvl w:ilvl="3" w:tentative="1">
-      <w:start w:val="1"/>
-      <w:numFmt w:val="decimal"/>
-      <w:lvlText w:val="%4."/>
-      <w:lvlJc w:val="left"/>
-      <w:pPr>
-        <w:tabs>
-          <w:tab w:val="num" w:pos="2880"/>
-        </w:tabs>
-        <w:ind w:left="2880" w:hanging="360"/>
-      </w:pPr>
-    </w:lvl>
-    <w:lvl w:ilvl="4" w:tentative="1">
-      <w:start w:val="1"/>
-      <w:numFmt w:val="decimal"/>
-      <w:lvlText w:val="%5."/>
-      <w:lvlJc w:val="left"/>
-      <w:pPr>
-        <w:tabs>
-          <w:tab w:val="num" w:pos="3600"/>
-        </w:tabs>
-        <w:ind w:left="3600" w:hanging="360"/>
-      </w:pPr>
-    </w:lvl>
-    <w:lvl w:ilvl="5" w:tentative="1">
-      <w:start w:val="1"/>
-      <w:numFmt w:val="decimal"/>
-      <w:lvlText w:val="%6."/>
-      <w:lvlJc w:val="left"/>
-      <w:pPr>
-        <w:tabs>
-          <w:tab w:val="num" w:pos="4320"/>
-        </w:tabs>
-        <w:ind w:left="4320" w:hanging="360"/>
-      </w:pPr>
-    </w:lvl>
-    <w:lvl w:ilvl="6" w:tentative="1">
-      <w:start w:val="1"/>
-      <w:numFmt w:val="decimal"/>
-      <w:lvlText w:val="%7."/>
-      <w:lvlJc w:val="left"/>
-      <w:pPr>
-        <w:tabs>
-          <w:tab w:val="num" w:pos="5040"/>
-        </w:tabs>
-        <w:ind w:left="5040" w:hanging="360"/>
-      </w:pPr>
-    </w:lvl>
-    <w:lvl w:ilvl="7" w:tentative="1">
-      <w:start w:val="1"/>
-      <w:numFmt w:val="decimal"/>
-      <w:lvlText w:val="%8."/>
-      <w:lvlJc w:val="left"/>
-      <w:pPr>
-        <w:tabs>
-          <w:tab w:val="num" w:pos="5760"/>
-        </w:tabs>
-        <w:ind w:left="5760" w:hanging="360"/>
-      </w:pPr>
-    </w:lvl>
-    <w:lvl w:ilvl="8" w:tentative="1">
-      <w:start w:val="1"/>
-      <w:numFmt w:val="decimal"/>
-      <w:lvlText w:val="%9."/>
-      <w:lvlJc w:val="left"/>
-      <w:pPr>
-        <w:tabs>
-          <w:tab w:val="num" w:pos="6480"/>
-        </w:tabs>
-        <w:ind w:left="6480" w:hanging="360"/>
-      </w:pPr>
-    </w:lvl>
-  </w:abstractNum>
-  <w:abstractNum w:abstractNumId="15" w15:restartNumberingAfterBreak="0">
+  <w:abstractNum w:abstractNumId="11" w15:restartNumberingAfterBreak="0">
     <w:nsid w:val="240D2D67"/>
     <w:multiLevelType w:val="multilevel"/>
     <w:tmpl w:val="274E43D6"/>
@@ -36771,7 +37075,7 @@
       </w:rPr>
     </w:lvl>
   </w:abstractNum>
-  <w:abstractNum w:abstractNumId="16" w15:restartNumberingAfterBreak="0">
+  <w:abstractNum w:abstractNumId="12" w15:restartNumberingAfterBreak="0">
     <w:nsid w:val="2B034F7B"/>
     <w:multiLevelType w:val="multilevel"/>
     <w:tmpl w:val="DD92D410"/>
@@ -36920,7 +37224,7 @@
       </w:rPr>
     </w:lvl>
   </w:abstractNum>
-  <w:abstractNum w:abstractNumId="17" w15:restartNumberingAfterBreak="0">
+  <w:abstractNum w:abstractNumId="13" w15:restartNumberingAfterBreak="0">
     <w:nsid w:val="2EE969A0"/>
     <w:multiLevelType w:val="multilevel"/>
     <w:tmpl w:val="F0EE61AE"/>
@@ -37069,120 +37373,7 @@
       </w:rPr>
     </w:lvl>
   </w:abstractNum>
-  <w:abstractNum w:abstractNumId="18" w15:restartNumberingAfterBreak="0">
-    <w:nsid w:val="30C95B17"/>
-    <w:multiLevelType w:val="multilevel"/>
-    <w:tmpl w:val="BAFCE558"/>
-    <w:lvl w:ilvl="0">
-      <w:start w:val="1"/>
-      <w:numFmt w:val="decimal"/>
-      <w:lvlText w:val="%1."/>
-      <w:lvlJc w:val="left"/>
-      <w:pPr>
-        <w:tabs>
-          <w:tab w:val="num" w:pos="720"/>
-        </w:tabs>
-        <w:ind w:left="720" w:hanging="360"/>
-      </w:pPr>
-    </w:lvl>
-    <w:lvl w:ilvl="1" w:tentative="1">
-      <w:start w:val="1"/>
-      <w:numFmt w:val="decimal"/>
-      <w:lvlText w:val="%2."/>
-      <w:lvlJc w:val="left"/>
-      <w:pPr>
-        <w:tabs>
-          <w:tab w:val="num" w:pos="1440"/>
-        </w:tabs>
-        <w:ind w:left="1440" w:hanging="360"/>
-      </w:pPr>
-    </w:lvl>
-    <w:lvl w:ilvl="2" w:tentative="1">
-      <w:start w:val="1"/>
-      <w:numFmt w:val="decimal"/>
-      <w:lvlText w:val="%3."/>
-      <w:lvlJc w:val="left"/>
-      <w:pPr>
-        <w:tabs>
-          <w:tab w:val="num" w:pos="2160"/>
-        </w:tabs>
-        <w:ind w:left="2160" w:hanging="360"/>
-      </w:pPr>
-    </w:lvl>
-    <w:lvl w:ilvl="3" w:tentative="1">
-      <w:start w:val="1"/>
-      <w:numFmt w:val="decimal"/>
-      <w:lvlText w:val="%4."/>
-      <w:lvlJc w:val="left"/>
-      <w:pPr>
-        <w:tabs>
-          <w:tab w:val="num" w:pos="2880"/>
-        </w:tabs>
-        <w:ind w:left="2880" w:hanging="360"/>
-      </w:pPr>
-    </w:lvl>
-    <w:lvl w:ilvl="4" w:tentative="1">
-      <w:start w:val="1"/>
-      <w:numFmt w:val="decimal"/>
-      <w:lvlText w:val="%5."/>
-      <w:lvlJc w:val="left"/>
-      <w:pPr>
-        <w:tabs>
-          <w:tab w:val="num" w:pos="3600"/>
-        </w:tabs>
-        <w:ind w:left="3600" w:hanging="360"/>
-      </w:pPr>
-    </w:lvl>
-    <w:lvl w:ilvl="5" w:tentative="1">
-      <w:start w:val="1"/>
-      <w:numFmt w:val="decimal"/>
-      <w:lvlText w:val="%6."/>
-      <w:lvlJc w:val="left"/>
-      <w:pPr>
-        <w:tabs>
-          <w:tab w:val="num" w:pos="4320"/>
-        </w:tabs>
-        <w:ind w:left="4320" w:hanging="360"/>
-      </w:pPr>
-    </w:lvl>
-    <w:lvl w:ilvl="6" w:tentative="1">
-      <w:start w:val="1"/>
-      <w:numFmt w:val="decimal"/>
-      <w:lvlText w:val="%7."/>
-      <w:lvlJc w:val="left"/>
-      <w:pPr>
-        <w:tabs>
-          <w:tab w:val="num" w:pos="5040"/>
-        </w:tabs>
-        <w:ind w:left="5040" w:hanging="360"/>
-      </w:pPr>
-    </w:lvl>
-    <w:lvl w:ilvl="7" w:tentative="1">
-      <w:start w:val="1"/>
-      <w:numFmt w:val="decimal"/>
-      <w:lvlText w:val="%8."/>
-      <w:lvlJc w:val="left"/>
-      <w:pPr>
-        <w:tabs>
-          <w:tab w:val="num" w:pos="5760"/>
-        </w:tabs>
-        <w:ind w:left="5760" w:hanging="360"/>
-      </w:pPr>
-    </w:lvl>
-    <w:lvl w:ilvl="8" w:tentative="1">
-      <w:start w:val="1"/>
-      <w:numFmt w:val="decimal"/>
-      <w:lvlText w:val="%9."/>
-      <w:lvlJc w:val="left"/>
-      <w:pPr>
-        <w:tabs>
-          <w:tab w:val="num" w:pos="6480"/>
-        </w:tabs>
-        <w:ind w:left="6480" w:hanging="360"/>
-      </w:pPr>
-    </w:lvl>
-  </w:abstractNum>
-  <w:abstractNum w:abstractNumId="19" w15:restartNumberingAfterBreak="0">
+  <w:abstractNum w:abstractNumId="14" w15:restartNumberingAfterBreak="0">
     <w:nsid w:val="315A7492"/>
     <w:multiLevelType w:val="multilevel"/>
     <w:tmpl w:val="CFBACC58"/>
@@ -37295,7 +37486,7 @@
       </w:pPr>
     </w:lvl>
   </w:abstractNum>
-  <w:abstractNum w:abstractNumId="20" w15:restartNumberingAfterBreak="0">
+  <w:abstractNum w:abstractNumId="15" w15:restartNumberingAfterBreak="0">
     <w:nsid w:val="356A5BF0"/>
     <w:multiLevelType w:val="multilevel"/>
     <w:tmpl w:val="C2F4A4FA"/>
@@ -37444,7 +37635,7 @@
       </w:rPr>
     </w:lvl>
   </w:abstractNum>
-  <w:abstractNum w:abstractNumId="21" w15:restartNumberingAfterBreak="0">
+  <w:abstractNum w:abstractNumId="16" w15:restartNumberingAfterBreak="0">
     <w:nsid w:val="35EC6CB0"/>
     <w:multiLevelType w:val="multilevel"/>
     <w:tmpl w:val="B9EE68BC"/>
@@ -37557,7 +37748,7 @@
       </w:pPr>
     </w:lvl>
   </w:abstractNum>
-  <w:abstractNum w:abstractNumId="22" w15:restartNumberingAfterBreak="0">
+  <w:abstractNum w:abstractNumId="17" w15:restartNumberingAfterBreak="0">
     <w:nsid w:val="368B3A7D"/>
     <w:multiLevelType w:val="multilevel"/>
     <w:tmpl w:val="1D941800"/>
@@ -37702,7 +37893,7 @@
       </w:rPr>
     </w:lvl>
   </w:abstractNum>
-  <w:abstractNum w:abstractNumId="23" w15:restartNumberingAfterBreak="0">
+  <w:abstractNum w:abstractNumId="18" w15:restartNumberingAfterBreak="0">
     <w:nsid w:val="37364E49"/>
     <w:multiLevelType w:val="multilevel"/>
     <w:tmpl w:val="1FF2EA36"/>
@@ -37815,7 +38006,7 @@
       </w:pPr>
     </w:lvl>
   </w:abstractNum>
-  <w:abstractNum w:abstractNumId="24" w15:restartNumberingAfterBreak="0">
+  <w:abstractNum w:abstractNumId="19" w15:restartNumberingAfterBreak="0">
     <w:nsid w:val="374A4048"/>
     <w:multiLevelType w:val="multilevel"/>
     <w:tmpl w:val="9FBEE264"/>
@@ -37964,120 +38155,7 @@
       </w:rPr>
     </w:lvl>
   </w:abstractNum>
-  <w:abstractNum w:abstractNumId="25" w15:restartNumberingAfterBreak="0">
-    <w:nsid w:val="38F37A21"/>
-    <w:multiLevelType w:val="multilevel"/>
-    <w:tmpl w:val="134EF82C"/>
-    <w:lvl w:ilvl="0">
-      <w:start w:val="1"/>
-      <w:numFmt w:val="decimal"/>
-      <w:lvlText w:val="%1."/>
-      <w:lvlJc w:val="left"/>
-      <w:pPr>
-        <w:tabs>
-          <w:tab w:val="num" w:pos="720"/>
-        </w:tabs>
-        <w:ind w:left="720" w:hanging="360"/>
-      </w:pPr>
-    </w:lvl>
-    <w:lvl w:ilvl="1" w:tentative="1">
-      <w:start w:val="1"/>
-      <w:numFmt w:val="decimal"/>
-      <w:lvlText w:val="%2."/>
-      <w:lvlJc w:val="left"/>
-      <w:pPr>
-        <w:tabs>
-          <w:tab w:val="num" w:pos="1440"/>
-        </w:tabs>
-        <w:ind w:left="1440" w:hanging="360"/>
-      </w:pPr>
-    </w:lvl>
-    <w:lvl w:ilvl="2" w:tentative="1">
-      <w:start w:val="1"/>
-      <w:numFmt w:val="decimal"/>
-      <w:lvlText w:val="%3."/>
-      <w:lvlJc w:val="left"/>
-      <w:pPr>
-        <w:tabs>
-          <w:tab w:val="num" w:pos="2160"/>
-        </w:tabs>
-        <w:ind w:left="2160" w:hanging="360"/>
-      </w:pPr>
-    </w:lvl>
-    <w:lvl w:ilvl="3" w:tentative="1">
-      <w:start w:val="1"/>
-      <w:numFmt w:val="decimal"/>
-      <w:lvlText w:val="%4."/>
-      <w:lvlJc w:val="left"/>
-      <w:pPr>
-        <w:tabs>
-          <w:tab w:val="num" w:pos="2880"/>
-        </w:tabs>
-        <w:ind w:left="2880" w:hanging="360"/>
-      </w:pPr>
-    </w:lvl>
-    <w:lvl w:ilvl="4" w:tentative="1">
-      <w:start w:val="1"/>
-      <w:numFmt w:val="decimal"/>
-      <w:lvlText w:val="%5."/>
-      <w:lvlJc w:val="left"/>
-      <w:pPr>
-        <w:tabs>
-          <w:tab w:val="num" w:pos="3600"/>
-        </w:tabs>
-        <w:ind w:left="3600" w:hanging="360"/>
-      </w:pPr>
-    </w:lvl>
-    <w:lvl w:ilvl="5" w:tentative="1">
-      <w:start w:val="1"/>
-      <w:numFmt w:val="decimal"/>
-      <w:lvlText w:val="%6."/>
-      <w:lvlJc w:val="left"/>
-      <w:pPr>
-        <w:tabs>
-          <w:tab w:val="num" w:pos="4320"/>
-        </w:tabs>
-        <w:ind w:left="4320" w:hanging="360"/>
-      </w:pPr>
-    </w:lvl>
-    <w:lvl w:ilvl="6" w:tentative="1">
-      <w:start w:val="1"/>
-      <w:numFmt w:val="decimal"/>
-      <w:lvlText w:val="%7."/>
-      <w:lvlJc w:val="left"/>
-      <w:pPr>
-        <w:tabs>
-          <w:tab w:val="num" w:pos="5040"/>
-        </w:tabs>
-        <w:ind w:left="5040" w:hanging="360"/>
-      </w:pPr>
-    </w:lvl>
-    <w:lvl w:ilvl="7" w:tentative="1">
-      <w:start w:val="1"/>
-      <w:numFmt w:val="decimal"/>
-      <w:lvlText w:val="%8."/>
-      <w:lvlJc w:val="left"/>
-      <w:pPr>
-        <w:tabs>
-          <w:tab w:val="num" w:pos="5760"/>
-        </w:tabs>
-        <w:ind w:left="5760" w:hanging="360"/>
-      </w:pPr>
-    </w:lvl>
-    <w:lvl w:ilvl="8" w:tentative="1">
-      <w:start w:val="1"/>
-      <w:numFmt w:val="decimal"/>
-      <w:lvlText w:val="%9."/>
-      <w:lvlJc w:val="left"/>
-      <w:pPr>
-        <w:tabs>
-          <w:tab w:val="num" w:pos="6480"/>
-        </w:tabs>
-        <w:ind w:left="6480" w:hanging="360"/>
-      </w:pPr>
-    </w:lvl>
-  </w:abstractNum>
-  <w:abstractNum w:abstractNumId="26" w15:restartNumberingAfterBreak="0">
+  <w:abstractNum w:abstractNumId="20" w15:restartNumberingAfterBreak="0">
     <w:nsid w:val="3F9B6D05"/>
     <w:multiLevelType w:val="multilevel"/>
     <w:tmpl w:val="5AD4F0B0"/>
@@ -38190,120 +38268,7 @@
       </w:pPr>
     </w:lvl>
   </w:abstractNum>
-  <w:abstractNum w:abstractNumId="27" w15:restartNumberingAfterBreak="0">
-    <w:nsid w:val="409E34BE"/>
-    <w:multiLevelType w:val="multilevel"/>
-    <w:tmpl w:val="219A7258"/>
-    <w:lvl w:ilvl="0">
-      <w:start w:val="1"/>
-      <w:numFmt w:val="decimal"/>
-      <w:lvlText w:val="%1."/>
-      <w:lvlJc w:val="left"/>
-      <w:pPr>
-        <w:tabs>
-          <w:tab w:val="num" w:pos="720"/>
-        </w:tabs>
-        <w:ind w:left="720" w:hanging="360"/>
-      </w:pPr>
-    </w:lvl>
-    <w:lvl w:ilvl="1" w:tentative="1">
-      <w:start w:val="1"/>
-      <w:numFmt w:val="decimal"/>
-      <w:lvlText w:val="%2."/>
-      <w:lvlJc w:val="left"/>
-      <w:pPr>
-        <w:tabs>
-          <w:tab w:val="num" w:pos="1440"/>
-        </w:tabs>
-        <w:ind w:left="1440" w:hanging="360"/>
-      </w:pPr>
-    </w:lvl>
-    <w:lvl w:ilvl="2" w:tentative="1">
-      <w:start w:val="1"/>
-      <w:numFmt w:val="decimal"/>
-      <w:lvlText w:val="%3."/>
-      <w:lvlJc w:val="left"/>
-      <w:pPr>
-        <w:tabs>
-          <w:tab w:val="num" w:pos="2160"/>
-        </w:tabs>
-        <w:ind w:left="2160" w:hanging="360"/>
-      </w:pPr>
-    </w:lvl>
-    <w:lvl w:ilvl="3" w:tentative="1">
-      <w:start w:val="1"/>
-      <w:numFmt w:val="decimal"/>
-      <w:lvlText w:val="%4."/>
-      <w:lvlJc w:val="left"/>
-      <w:pPr>
-        <w:tabs>
-          <w:tab w:val="num" w:pos="2880"/>
-        </w:tabs>
-        <w:ind w:left="2880" w:hanging="360"/>
-      </w:pPr>
-    </w:lvl>
-    <w:lvl w:ilvl="4" w:tentative="1">
-      <w:start w:val="1"/>
-      <w:numFmt w:val="decimal"/>
-      <w:lvlText w:val="%5."/>
-      <w:lvlJc w:val="left"/>
-      <w:pPr>
-        <w:tabs>
-          <w:tab w:val="num" w:pos="3600"/>
-        </w:tabs>
-        <w:ind w:left="3600" w:hanging="360"/>
-      </w:pPr>
-    </w:lvl>
-    <w:lvl w:ilvl="5" w:tentative="1">
-      <w:start w:val="1"/>
-      <w:numFmt w:val="decimal"/>
-      <w:lvlText w:val="%6."/>
-      <w:lvlJc w:val="left"/>
-      <w:pPr>
-        <w:tabs>
-          <w:tab w:val="num" w:pos="4320"/>
-        </w:tabs>
-        <w:ind w:left="4320" w:hanging="360"/>
-      </w:pPr>
-    </w:lvl>
-    <w:lvl w:ilvl="6" w:tentative="1">
-      <w:start w:val="1"/>
-      <w:numFmt w:val="decimal"/>
-      <w:lvlText w:val="%7."/>
-      <w:lvlJc w:val="left"/>
-      <w:pPr>
-        <w:tabs>
-          <w:tab w:val="num" w:pos="5040"/>
-        </w:tabs>
-        <w:ind w:left="5040" w:hanging="360"/>
-      </w:pPr>
-    </w:lvl>
-    <w:lvl w:ilvl="7" w:tentative="1">
-      <w:start w:val="1"/>
-      <w:numFmt w:val="decimal"/>
-      <w:lvlText w:val="%8."/>
-      <w:lvlJc w:val="left"/>
-      <w:pPr>
-        <w:tabs>
-          <w:tab w:val="num" w:pos="5760"/>
-        </w:tabs>
-        <w:ind w:left="5760" w:hanging="360"/>
-      </w:pPr>
-    </w:lvl>
-    <w:lvl w:ilvl="8" w:tentative="1">
-      <w:start w:val="1"/>
-      <w:numFmt w:val="decimal"/>
-      <w:lvlText w:val="%9."/>
-      <w:lvlJc w:val="left"/>
-      <w:pPr>
-        <w:tabs>
-          <w:tab w:val="num" w:pos="6480"/>
-        </w:tabs>
-        <w:ind w:left="6480" w:hanging="360"/>
-      </w:pPr>
-    </w:lvl>
-  </w:abstractNum>
-  <w:abstractNum w:abstractNumId="28" w15:restartNumberingAfterBreak="0">
+  <w:abstractNum w:abstractNumId="21" w15:restartNumberingAfterBreak="0">
     <w:nsid w:val="418716C6"/>
     <w:multiLevelType w:val="multilevel"/>
     <w:tmpl w:val="B9C41A90"/>
@@ -38416,120 +38381,7 @@
       </w:pPr>
     </w:lvl>
   </w:abstractNum>
-  <w:abstractNum w:abstractNumId="29" w15:restartNumberingAfterBreak="0">
-    <w:nsid w:val="42B606F6"/>
-    <w:multiLevelType w:val="multilevel"/>
-    <w:tmpl w:val="6A86F7DA"/>
-    <w:lvl w:ilvl="0">
-      <w:start w:val="1"/>
-      <w:numFmt w:val="decimal"/>
-      <w:lvlText w:val="%1."/>
-      <w:lvlJc w:val="left"/>
-      <w:pPr>
-        <w:tabs>
-          <w:tab w:val="num" w:pos="720"/>
-        </w:tabs>
-        <w:ind w:left="720" w:hanging="360"/>
-      </w:pPr>
-    </w:lvl>
-    <w:lvl w:ilvl="1" w:tentative="1">
-      <w:start w:val="1"/>
-      <w:numFmt w:val="decimal"/>
-      <w:lvlText w:val="%2."/>
-      <w:lvlJc w:val="left"/>
-      <w:pPr>
-        <w:tabs>
-          <w:tab w:val="num" w:pos="1440"/>
-        </w:tabs>
-        <w:ind w:left="1440" w:hanging="360"/>
-      </w:pPr>
-    </w:lvl>
-    <w:lvl w:ilvl="2" w:tentative="1">
-      <w:start w:val="1"/>
-      <w:numFmt w:val="decimal"/>
-      <w:lvlText w:val="%3."/>
-      <w:lvlJc w:val="left"/>
-      <w:pPr>
-        <w:tabs>
-          <w:tab w:val="num" w:pos="2160"/>
-        </w:tabs>
-        <w:ind w:left="2160" w:hanging="360"/>
-      </w:pPr>
-    </w:lvl>
-    <w:lvl w:ilvl="3" w:tentative="1">
-      <w:start w:val="1"/>
-      <w:numFmt w:val="decimal"/>
-      <w:lvlText w:val="%4."/>
-      <w:lvlJc w:val="left"/>
-      <w:pPr>
-        <w:tabs>
-          <w:tab w:val="num" w:pos="2880"/>
-        </w:tabs>
-        <w:ind w:left="2880" w:hanging="360"/>
-      </w:pPr>
-    </w:lvl>
-    <w:lvl w:ilvl="4" w:tentative="1">
-      <w:start w:val="1"/>
-      <w:numFmt w:val="decimal"/>
-      <w:lvlText w:val="%5."/>
-      <w:lvlJc w:val="left"/>
-      <w:pPr>
-        <w:tabs>
-          <w:tab w:val="num" w:pos="3600"/>
-        </w:tabs>
-        <w:ind w:left="3600" w:hanging="360"/>
-      </w:pPr>
-    </w:lvl>
-    <w:lvl w:ilvl="5" w:tentative="1">
-      <w:start w:val="1"/>
-      <w:numFmt w:val="decimal"/>
-      <w:lvlText w:val="%6."/>
-      <w:lvlJc w:val="left"/>
-      <w:pPr>
-        <w:tabs>
-          <w:tab w:val="num" w:pos="4320"/>
-        </w:tabs>
-        <w:ind w:left="4320" w:hanging="360"/>
-      </w:pPr>
-    </w:lvl>
-    <w:lvl w:ilvl="6" w:tentative="1">
-      <w:start w:val="1"/>
-      <w:numFmt w:val="decimal"/>
-      <w:lvlText w:val="%7."/>
-      <w:lvlJc w:val="left"/>
-      <w:pPr>
-        <w:tabs>
-          <w:tab w:val="num" w:pos="5040"/>
-        </w:tabs>
-        <w:ind w:left="5040" w:hanging="360"/>
-      </w:pPr>
-    </w:lvl>
-    <w:lvl w:ilvl="7" w:tentative="1">
-      <w:start w:val="1"/>
-      <w:numFmt w:val="decimal"/>
-      <w:lvlText w:val="%8."/>
-      <w:lvlJc w:val="left"/>
-      <w:pPr>
-        <w:tabs>
-          <w:tab w:val="num" w:pos="5760"/>
-        </w:tabs>
-        <w:ind w:left="5760" w:hanging="360"/>
-      </w:pPr>
-    </w:lvl>
-    <w:lvl w:ilvl="8" w:tentative="1">
-      <w:start w:val="1"/>
-      <w:numFmt w:val="decimal"/>
-      <w:lvlText w:val="%9."/>
-      <w:lvlJc w:val="left"/>
-      <w:pPr>
-        <w:tabs>
-          <w:tab w:val="num" w:pos="6480"/>
-        </w:tabs>
-        <w:ind w:left="6480" w:hanging="360"/>
-      </w:pPr>
-    </w:lvl>
-  </w:abstractNum>
-  <w:abstractNum w:abstractNumId="30" w15:restartNumberingAfterBreak="0">
+  <w:abstractNum w:abstractNumId="22" w15:restartNumberingAfterBreak="0">
     <w:nsid w:val="47DC0B2C"/>
     <w:multiLevelType w:val="multilevel"/>
     <w:tmpl w:val="B3680974"/>
@@ -38642,7 +38494,7 @@
       </w:pPr>
     </w:lvl>
   </w:abstractNum>
-  <w:abstractNum w:abstractNumId="31" w15:restartNumberingAfterBreak="0">
+  <w:abstractNum w:abstractNumId="23" w15:restartNumberingAfterBreak="0">
     <w:nsid w:val="49080C56"/>
     <w:multiLevelType w:val="multilevel"/>
     <w:tmpl w:val="F9EC9B32"/>
@@ -38755,120 +38607,7 @@
       </w:pPr>
     </w:lvl>
   </w:abstractNum>
-  <w:abstractNum w:abstractNumId="32" w15:restartNumberingAfterBreak="0">
-    <w:nsid w:val="4B357EF1"/>
-    <w:multiLevelType w:val="multilevel"/>
-    <w:tmpl w:val="840E8334"/>
-    <w:lvl w:ilvl="0">
-      <w:start w:val="1"/>
-      <w:numFmt w:val="decimal"/>
-      <w:lvlText w:val="%1."/>
-      <w:lvlJc w:val="left"/>
-      <w:pPr>
-        <w:tabs>
-          <w:tab w:val="num" w:pos="720"/>
-        </w:tabs>
-        <w:ind w:left="720" w:hanging="360"/>
-      </w:pPr>
-    </w:lvl>
-    <w:lvl w:ilvl="1" w:tentative="1">
-      <w:start w:val="1"/>
-      <w:numFmt w:val="decimal"/>
-      <w:lvlText w:val="%2."/>
-      <w:lvlJc w:val="left"/>
-      <w:pPr>
-        <w:tabs>
-          <w:tab w:val="num" w:pos="1440"/>
-        </w:tabs>
-        <w:ind w:left="1440" w:hanging="360"/>
-      </w:pPr>
-    </w:lvl>
-    <w:lvl w:ilvl="2" w:tentative="1">
-      <w:start w:val="1"/>
-      <w:numFmt w:val="decimal"/>
-      <w:lvlText w:val="%3."/>
-      <w:lvlJc w:val="left"/>
-      <w:pPr>
-        <w:tabs>
-          <w:tab w:val="num" w:pos="2160"/>
-        </w:tabs>
-        <w:ind w:left="2160" w:hanging="360"/>
-      </w:pPr>
-    </w:lvl>
-    <w:lvl w:ilvl="3" w:tentative="1">
-      <w:start w:val="1"/>
-      <w:numFmt w:val="decimal"/>
-      <w:lvlText w:val="%4."/>
-      <w:lvlJc w:val="left"/>
-      <w:pPr>
-        <w:tabs>
-          <w:tab w:val="num" w:pos="2880"/>
-        </w:tabs>
-        <w:ind w:left="2880" w:hanging="360"/>
-      </w:pPr>
-    </w:lvl>
-    <w:lvl w:ilvl="4" w:tentative="1">
-      <w:start w:val="1"/>
-      <w:numFmt w:val="decimal"/>
-      <w:lvlText w:val="%5."/>
-      <w:lvlJc w:val="left"/>
-      <w:pPr>
-        <w:tabs>
-          <w:tab w:val="num" w:pos="3600"/>
-        </w:tabs>
-        <w:ind w:left="3600" w:hanging="360"/>
-      </w:pPr>
-    </w:lvl>
-    <w:lvl w:ilvl="5" w:tentative="1">
-      <w:start w:val="1"/>
-      <w:numFmt w:val="decimal"/>
-      <w:lvlText w:val="%6."/>
-      <w:lvlJc w:val="left"/>
-      <w:pPr>
-        <w:tabs>
-          <w:tab w:val="num" w:pos="4320"/>
-        </w:tabs>
-        <w:ind w:left="4320" w:hanging="360"/>
-      </w:pPr>
-    </w:lvl>
-    <w:lvl w:ilvl="6" w:tentative="1">
-      <w:start w:val="1"/>
-      <w:numFmt w:val="decimal"/>
-      <w:lvlText w:val="%7."/>
-      <w:lvlJc w:val="left"/>
-      <w:pPr>
-        <w:tabs>
-          <w:tab w:val="num" w:pos="5040"/>
-        </w:tabs>
-        <w:ind w:left="5040" w:hanging="360"/>
-      </w:pPr>
-    </w:lvl>
-    <w:lvl w:ilvl="7" w:tentative="1">
-      <w:start w:val="1"/>
-      <w:numFmt w:val="decimal"/>
-      <w:lvlText w:val="%8."/>
-      <w:lvlJc w:val="left"/>
-      <w:pPr>
-        <w:tabs>
-          <w:tab w:val="num" w:pos="5760"/>
-        </w:tabs>
-        <w:ind w:left="5760" w:hanging="360"/>
-      </w:pPr>
-    </w:lvl>
-    <w:lvl w:ilvl="8" w:tentative="1">
-      <w:start w:val="1"/>
-      <w:numFmt w:val="decimal"/>
-      <w:lvlText w:val="%9."/>
-      <w:lvlJc w:val="left"/>
-      <w:pPr>
-        <w:tabs>
-          <w:tab w:val="num" w:pos="6480"/>
-        </w:tabs>
-        <w:ind w:left="6480" w:hanging="360"/>
-      </w:pPr>
-    </w:lvl>
-  </w:abstractNum>
-  <w:abstractNum w:abstractNumId="33" w15:restartNumberingAfterBreak="0">
+  <w:abstractNum w:abstractNumId="24" w15:restartNumberingAfterBreak="0">
     <w:nsid w:val="4BC63125"/>
     <w:multiLevelType w:val="multilevel"/>
     <w:tmpl w:val="3280AE80"/>
@@ -38981,233 +38720,7 @@
       </w:pPr>
     </w:lvl>
   </w:abstractNum>
-  <w:abstractNum w:abstractNumId="34" w15:restartNumberingAfterBreak="0">
-    <w:nsid w:val="4BE30094"/>
-    <w:multiLevelType w:val="multilevel"/>
-    <w:tmpl w:val="ABDEF738"/>
-    <w:lvl w:ilvl="0">
-      <w:start w:val="1"/>
-      <w:numFmt w:val="decimal"/>
-      <w:lvlText w:val="%1."/>
-      <w:lvlJc w:val="left"/>
-      <w:pPr>
-        <w:tabs>
-          <w:tab w:val="num" w:pos="720"/>
-        </w:tabs>
-        <w:ind w:left="720" w:hanging="360"/>
-      </w:pPr>
-    </w:lvl>
-    <w:lvl w:ilvl="1" w:tentative="1">
-      <w:start w:val="1"/>
-      <w:numFmt w:val="decimal"/>
-      <w:lvlText w:val="%2."/>
-      <w:lvlJc w:val="left"/>
-      <w:pPr>
-        <w:tabs>
-          <w:tab w:val="num" w:pos="1440"/>
-        </w:tabs>
-        <w:ind w:left="1440" w:hanging="360"/>
-      </w:pPr>
-    </w:lvl>
-    <w:lvl w:ilvl="2" w:tentative="1">
-      <w:start w:val="1"/>
-      <w:numFmt w:val="decimal"/>
-      <w:lvlText w:val="%3."/>
-      <w:lvlJc w:val="left"/>
-      <w:pPr>
-        <w:tabs>
-          <w:tab w:val="num" w:pos="2160"/>
-        </w:tabs>
-        <w:ind w:left="2160" w:hanging="360"/>
-      </w:pPr>
-    </w:lvl>
-    <w:lvl w:ilvl="3" w:tentative="1">
-      <w:start w:val="1"/>
-      <w:numFmt w:val="decimal"/>
-      <w:lvlText w:val="%4."/>
-      <w:lvlJc w:val="left"/>
-      <w:pPr>
-        <w:tabs>
-          <w:tab w:val="num" w:pos="2880"/>
-        </w:tabs>
-        <w:ind w:left="2880" w:hanging="360"/>
-      </w:pPr>
-    </w:lvl>
-    <w:lvl w:ilvl="4" w:tentative="1">
-      <w:start w:val="1"/>
-      <w:numFmt w:val="decimal"/>
-      <w:lvlText w:val="%5."/>
-      <w:lvlJc w:val="left"/>
-      <w:pPr>
-        <w:tabs>
-          <w:tab w:val="num" w:pos="3600"/>
-        </w:tabs>
-        <w:ind w:left="3600" w:hanging="360"/>
-      </w:pPr>
-    </w:lvl>
-    <w:lvl w:ilvl="5" w:tentative="1">
-      <w:start w:val="1"/>
-      <w:numFmt w:val="decimal"/>
-      <w:lvlText w:val="%6."/>
-      <w:lvlJc w:val="left"/>
-      <w:pPr>
-        <w:tabs>
-          <w:tab w:val="num" w:pos="4320"/>
-        </w:tabs>
-        <w:ind w:left="4320" w:hanging="360"/>
-      </w:pPr>
-    </w:lvl>
-    <w:lvl w:ilvl="6" w:tentative="1">
-      <w:start w:val="1"/>
-      <w:numFmt w:val="decimal"/>
-      <w:lvlText w:val="%7."/>
-      <w:lvlJc w:val="left"/>
-      <w:pPr>
-        <w:tabs>
-          <w:tab w:val="num" w:pos="5040"/>
-        </w:tabs>
-        <w:ind w:left="5040" w:hanging="360"/>
-      </w:pPr>
-    </w:lvl>
-    <w:lvl w:ilvl="7" w:tentative="1">
-      <w:start w:val="1"/>
-      <w:numFmt w:val="decimal"/>
-      <w:lvlText w:val="%8."/>
-      <w:lvlJc w:val="left"/>
-      <w:pPr>
-        <w:tabs>
-          <w:tab w:val="num" w:pos="5760"/>
-        </w:tabs>
-        <w:ind w:left="5760" w:hanging="360"/>
-      </w:pPr>
-    </w:lvl>
-    <w:lvl w:ilvl="8" w:tentative="1">
-      <w:start w:val="1"/>
-      <w:numFmt w:val="decimal"/>
-      <w:lvlText w:val="%9."/>
-      <w:lvlJc w:val="left"/>
-      <w:pPr>
-        <w:tabs>
-          <w:tab w:val="num" w:pos="6480"/>
-        </w:tabs>
-        <w:ind w:left="6480" w:hanging="360"/>
-      </w:pPr>
-    </w:lvl>
-  </w:abstractNum>
-  <w:abstractNum w:abstractNumId="35" w15:restartNumberingAfterBreak="0">
-    <w:nsid w:val="4D81213A"/>
-    <w:multiLevelType w:val="multilevel"/>
-    <w:tmpl w:val="D892E22A"/>
-    <w:lvl w:ilvl="0">
-      <w:start w:val="1"/>
-      <w:numFmt w:val="decimal"/>
-      <w:lvlText w:val="%1."/>
-      <w:lvlJc w:val="left"/>
-      <w:pPr>
-        <w:tabs>
-          <w:tab w:val="num" w:pos="720"/>
-        </w:tabs>
-        <w:ind w:left="720" w:hanging="360"/>
-      </w:pPr>
-    </w:lvl>
-    <w:lvl w:ilvl="1" w:tentative="1">
-      <w:start w:val="1"/>
-      <w:numFmt w:val="decimal"/>
-      <w:lvlText w:val="%2."/>
-      <w:lvlJc w:val="left"/>
-      <w:pPr>
-        <w:tabs>
-          <w:tab w:val="num" w:pos="1440"/>
-        </w:tabs>
-        <w:ind w:left="1440" w:hanging="360"/>
-      </w:pPr>
-    </w:lvl>
-    <w:lvl w:ilvl="2" w:tentative="1">
-      <w:start w:val="1"/>
-      <w:numFmt w:val="decimal"/>
-      <w:lvlText w:val="%3."/>
-      <w:lvlJc w:val="left"/>
-      <w:pPr>
-        <w:tabs>
-          <w:tab w:val="num" w:pos="2160"/>
-        </w:tabs>
-        <w:ind w:left="2160" w:hanging="360"/>
-      </w:pPr>
-    </w:lvl>
-    <w:lvl w:ilvl="3" w:tentative="1">
-      <w:start w:val="1"/>
-      <w:numFmt w:val="decimal"/>
-      <w:lvlText w:val="%4."/>
-      <w:lvlJc w:val="left"/>
-      <w:pPr>
-        <w:tabs>
-          <w:tab w:val="num" w:pos="2880"/>
-        </w:tabs>
-        <w:ind w:left="2880" w:hanging="360"/>
-      </w:pPr>
-    </w:lvl>
-    <w:lvl w:ilvl="4" w:tentative="1">
-      <w:start w:val="1"/>
-      <w:numFmt w:val="decimal"/>
-      <w:lvlText w:val="%5."/>
-      <w:lvlJc w:val="left"/>
-      <w:pPr>
-        <w:tabs>
-          <w:tab w:val="num" w:pos="3600"/>
-        </w:tabs>
-        <w:ind w:left="3600" w:hanging="360"/>
-      </w:pPr>
-    </w:lvl>
-    <w:lvl w:ilvl="5" w:tentative="1">
-      <w:start w:val="1"/>
-      <w:numFmt w:val="decimal"/>
-      <w:lvlText w:val="%6."/>
-      <w:lvlJc w:val="left"/>
-      <w:pPr>
-        <w:tabs>
-          <w:tab w:val="num" w:pos="4320"/>
-        </w:tabs>
-        <w:ind w:left="4320" w:hanging="360"/>
-      </w:pPr>
-    </w:lvl>
-    <w:lvl w:ilvl="6" w:tentative="1">
-      <w:start w:val="1"/>
-      <w:numFmt w:val="decimal"/>
-      <w:lvlText w:val="%7."/>
-      <w:lvlJc w:val="left"/>
-      <w:pPr>
-        <w:tabs>
-          <w:tab w:val="num" w:pos="5040"/>
-        </w:tabs>
-        <w:ind w:left="5040" w:hanging="360"/>
-      </w:pPr>
-    </w:lvl>
-    <w:lvl w:ilvl="7" w:tentative="1">
-      <w:start w:val="1"/>
-      <w:numFmt w:val="decimal"/>
-      <w:lvlText w:val="%8."/>
-      <w:lvlJc w:val="left"/>
-      <w:pPr>
-        <w:tabs>
-          <w:tab w:val="num" w:pos="5760"/>
-        </w:tabs>
-        <w:ind w:left="5760" w:hanging="360"/>
-      </w:pPr>
-    </w:lvl>
-    <w:lvl w:ilvl="8" w:tentative="1">
-      <w:start w:val="1"/>
-      <w:numFmt w:val="decimal"/>
-      <w:lvlText w:val="%9."/>
-      <w:lvlJc w:val="left"/>
-      <w:pPr>
-        <w:tabs>
-          <w:tab w:val="num" w:pos="6480"/>
-        </w:tabs>
-        <w:ind w:left="6480" w:hanging="360"/>
-      </w:pPr>
-    </w:lvl>
-  </w:abstractNum>
-  <w:abstractNum w:abstractNumId="36" w15:restartNumberingAfterBreak="0">
+  <w:abstractNum w:abstractNumId="25" w15:restartNumberingAfterBreak="0">
     <w:nsid w:val="520D1253"/>
     <w:multiLevelType w:val="multilevel"/>
     <w:tmpl w:val="43323A2A"/>
@@ -39320,7 +38833,7 @@
       </w:pPr>
     </w:lvl>
   </w:abstractNum>
-  <w:abstractNum w:abstractNumId="37" w15:restartNumberingAfterBreak="0">
+  <w:abstractNum w:abstractNumId="26" w15:restartNumberingAfterBreak="0">
     <w:nsid w:val="52AC56E6"/>
     <w:multiLevelType w:val="multilevel"/>
     <w:tmpl w:val="0A0A8FC8"/>
@@ -39469,7 +38982,7 @@
       </w:rPr>
     </w:lvl>
   </w:abstractNum>
-  <w:abstractNum w:abstractNumId="38" w15:restartNumberingAfterBreak="0">
+  <w:abstractNum w:abstractNumId="27" w15:restartNumberingAfterBreak="0">
     <w:nsid w:val="57A800E4"/>
     <w:multiLevelType w:val="multilevel"/>
     <w:tmpl w:val="B6123D8C"/>
@@ -39582,7 +39095,7 @@
       </w:pPr>
     </w:lvl>
   </w:abstractNum>
-  <w:abstractNum w:abstractNumId="39" w15:restartNumberingAfterBreak="0">
+  <w:abstractNum w:abstractNumId="28" w15:restartNumberingAfterBreak="0">
     <w:nsid w:val="59030331"/>
     <w:multiLevelType w:val="multilevel"/>
     <w:tmpl w:val="15DAA0D2"/>
@@ -39731,459 +39244,7 @@
       </w:rPr>
     </w:lvl>
   </w:abstractNum>
-  <w:abstractNum w:abstractNumId="40" w15:restartNumberingAfterBreak="0">
-    <w:nsid w:val="60073B3E"/>
-    <w:multiLevelType w:val="multilevel"/>
-    <w:tmpl w:val="FFAAA3E8"/>
-    <w:lvl w:ilvl="0">
-      <w:start w:val="1"/>
-      <w:numFmt w:val="decimal"/>
-      <w:lvlText w:val="%1."/>
-      <w:lvlJc w:val="left"/>
-      <w:pPr>
-        <w:tabs>
-          <w:tab w:val="num" w:pos="720"/>
-        </w:tabs>
-        <w:ind w:left="720" w:hanging="360"/>
-      </w:pPr>
-    </w:lvl>
-    <w:lvl w:ilvl="1" w:tentative="1">
-      <w:start w:val="1"/>
-      <w:numFmt w:val="decimal"/>
-      <w:lvlText w:val="%2."/>
-      <w:lvlJc w:val="left"/>
-      <w:pPr>
-        <w:tabs>
-          <w:tab w:val="num" w:pos="1440"/>
-        </w:tabs>
-        <w:ind w:left="1440" w:hanging="360"/>
-      </w:pPr>
-    </w:lvl>
-    <w:lvl w:ilvl="2" w:tentative="1">
-      <w:start w:val="1"/>
-      <w:numFmt w:val="decimal"/>
-      <w:lvlText w:val="%3."/>
-      <w:lvlJc w:val="left"/>
-      <w:pPr>
-        <w:tabs>
-          <w:tab w:val="num" w:pos="2160"/>
-        </w:tabs>
-        <w:ind w:left="2160" w:hanging="360"/>
-      </w:pPr>
-    </w:lvl>
-    <w:lvl w:ilvl="3" w:tentative="1">
-      <w:start w:val="1"/>
-      <w:numFmt w:val="decimal"/>
-      <w:lvlText w:val="%4."/>
-      <w:lvlJc w:val="left"/>
-      <w:pPr>
-        <w:tabs>
-          <w:tab w:val="num" w:pos="2880"/>
-        </w:tabs>
-        <w:ind w:left="2880" w:hanging="360"/>
-      </w:pPr>
-    </w:lvl>
-    <w:lvl w:ilvl="4" w:tentative="1">
-      <w:start w:val="1"/>
-      <w:numFmt w:val="decimal"/>
-      <w:lvlText w:val="%5."/>
-      <w:lvlJc w:val="left"/>
-      <w:pPr>
-        <w:tabs>
-          <w:tab w:val="num" w:pos="3600"/>
-        </w:tabs>
-        <w:ind w:left="3600" w:hanging="360"/>
-      </w:pPr>
-    </w:lvl>
-    <w:lvl w:ilvl="5" w:tentative="1">
-      <w:start w:val="1"/>
-      <w:numFmt w:val="decimal"/>
-      <w:lvlText w:val="%6."/>
-      <w:lvlJc w:val="left"/>
-      <w:pPr>
-        <w:tabs>
-          <w:tab w:val="num" w:pos="4320"/>
-        </w:tabs>
-        <w:ind w:left="4320" w:hanging="360"/>
-      </w:pPr>
-    </w:lvl>
-    <w:lvl w:ilvl="6" w:tentative="1">
-      <w:start w:val="1"/>
-      <w:numFmt w:val="decimal"/>
-      <w:lvlText w:val="%7."/>
-      <w:lvlJc w:val="left"/>
-      <w:pPr>
-        <w:tabs>
-          <w:tab w:val="num" w:pos="5040"/>
-        </w:tabs>
-        <w:ind w:left="5040" w:hanging="360"/>
-      </w:pPr>
-    </w:lvl>
-    <w:lvl w:ilvl="7" w:tentative="1">
-      <w:start w:val="1"/>
-      <w:numFmt w:val="decimal"/>
-      <w:lvlText w:val="%8."/>
-      <w:lvlJc w:val="left"/>
-      <w:pPr>
-        <w:tabs>
-          <w:tab w:val="num" w:pos="5760"/>
-        </w:tabs>
-        <w:ind w:left="5760" w:hanging="360"/>
-      </w:pPr>
-    </w:lvl>
-    <w:lvl w:ilvl="8" w:tentative="1">
-      <w:start w:val="1"/>
-      <w:numFmt w:val="decimal"/>
-      <w:lvlText w:val="%9."/>
-      <w:lvlJc w:val="left"/>
-      <w:pPr>
-        <w:tabs>
-          <w:tab w:val="num" w:pos="6480"/>
-        </w:tabs>
-        <w:ind w:left="6480" w:hanging="360"/>
-      </w:pPr>
-    </w:lvl>
-  </w:abstractNum>
-  <w:abstractNum w:abstractNumId="41" w15:restartNumberingAfterBreak="0">
-    <w:nsid w:val="61611A98"/>
-    <w:multiLevelType w:val="multilevel"/>
-    <w:tmpl w:val="F4A88C5A"/>
-    <w:lvl w:ilvl="0">
-      <w:start w:val="1"/>
-      <w:numFmt w:val="decimal"/>
-      <w:lvlText w:val="%1."/>
-      <w:lvlJc w:val="left"/>
-      <w:pPr>
-        <w:tabs>
-          <w:tab w:val="num" w:pos="720"/>
-        </w:tabs>
-        <w:ind w:left="720" w:hanging="360"/>
-      </w:pPr>
-    </w:lvl>
-    <w:lvl w:ilvl="1" w:tentative="1">
-      <w:start w:val="1"/>
-      <w:numFmt w:val="decimal"/>
-      <w:lvlText w:val="%2."/>
-      <w:lvlJc w:val="left"/>
-      <w:pPr>
-        <w:tabs>
-          <w:tab w:val="num" w:pos="1440"/>
-        </w:tabs>
-        <w:ind w:left="1440" w:hanging="360"/>
-      </w:pPr>
-    </w:lvl>
-    <w:lvl w:ilvl="2" w:tentative="1">
-      <w:start w:val="1"/>
-      <w:numFmt w:val="decimal"/>
-      <w:lvlText w:val="%3."/>
-      <w:lvlJc w:val="left"/>
-      <w:pPr>
-        <w:tabs>
-          <w:tab w:val="num" w:pos="2160"/>
-        </w:tabs>
-        <w:ind w:left="2160" w:hanging="360"/>
-      </w:pPr>
-    </w:lvl>
-    <w:lvl w:ilvl="3" w:tentative="1">
-      <w:start w:val="1"/>
-      <w:numFmt w:val="decimal"/>
-      <w:lvlText w:val="%4."/>
-      <w:lvlJc w:val="left"/>
-      <w:pPr>
-        <w:tabs>
-          <w:tab w:val="num" w:pos="2880"/>
-        </w:tabs>
-        <w:ind w:left="2880" w:hanging="360"/>
-      </w:pPr>
-    </w:lvl>
-    <w:lvl w:ilvl="4" w:tentative="1">
-      <w:start w:val="1"/>
-      <w:numFmt w:val="decimal"/>
-      <w:lvlText w:val="%5."/>
-      <w:lvlJc w:val="left"/>
-      <w:pPr>
-        <w:tabs>
-          <w:tab w:val="num" w:pos="3600"/>
-        </w:tabs>
-        <w:ind w:left="3600" w:hanging="360"/>
-      </w:pPr>
-    </w:lvl>
-    <w:lvl w:ilvl="5" w:tentative="1">
-      <w:start w:val="1"/>
-      <w:numFmt w:val="decimal"/>
-      <w:lvlText w:val="%6."/>
-      <w:lvlJc w:val="left"/>
-      <w:pPr>
-        <w:tabs>
-          <w:tab w:val="num" w:pos="4320"/>
-        </w:tabs>
-        <w:ind w:left="4320" w:hanging="360"/>
-      </w:pPr>
-    </w:lvl>
-    <w:lvl w:ilvl="6" w:tentative="1">
-      <w:start w:val="1"/>
-      <w:numFmt w:val="decimal"/>
-      <w:lvlText w:val="%7."/>
-      <w:lvlJc w:val="left"/>
-      <w:pPr>
-        <w:tabs>
-          <w:tab w:val="num" w:pos="5040"/>
-        </w:tabs>
-        <w:ind w:left="5040" w:hanging="360"/>
-      </w:pPr>
-    </w:lvl>
-    <w:lvl w:ilvl="7" w:tentative="1">
-      <w:start w:val="1"/>
-      <w:numFmt w:val="decimal"/>
-      <w:lvlText w:val="%8."/>
-      <w:lvlJc w:val="left"/>
-      <w:pPr>
-        <w:tabs>
-          <w:tab w:val="num" w:pos="5760"/>
-        </w:tabs>
-        <w:ind w:left="5760" w:hanging="360"/>
-      </w:pPr>
-    </w:lvl>
-    <w:lvl w:ilvl="8" w:tentative="1">
-      <w:start w:val="1"/>
-      <w:numFmt w:val="decimal"/>
-      <w:lvlText w:val="%9."/>
-      <w:lvlJc w:val="left"/>
-      <w:pPr>
-        <w:tabs>
-          <w:tab w:val="num" w:pos="6480"/>
-        </w:tabs>
-        <w:ind w:left="6480" w:hanging="360"/>
-      </w:pPr>
-    </w:lvl>
-  </w:abstractNum>
-  <w:abstractNum w:abstractNumId="42" w15:restartNumberingAfterBreak="0">
-    <w:nsid w:val="6302178C"/>
-    <w:multiLevelType w:val="multilevel"/>
-    <w:tmpl w:val="00ACFECC"/>
-    <w:lvl w:ilvl="0">
-      <w:start w:val="1"/>
-      <w:numFmt w:val="decimal"/>
-      <w:lvlText w:val="%1."/>
-      <w:lvlJc w:val="left"/>
-      <w:pPr>
-        <w:tabs>
-          <w:tab w:val="num" w:pos="720"/>
-        </w:tabs>
-        <w:ind w:left="720" w:hanging="360"/>
-      </w:pPr>
-    </w:lvl>
-    <w:lvl w:ilvl="1" w:tentative="1">
-      <w:start w:val="1"/>
-      <w:numFmt w:val="decimal"/>
-      <w:lvlText w:val="%2."/>
-      <w:lvlJc w:val="left"/>
-      <w:pPr>
-        <w:tabs>
-          <w:tab w:val="num" w:pos="1440"/>
-        </w:tabs>
-        <w:ind w:left="1440" w:hanging="360"/>
-      </w:pPr>
-    </w:lvl>
-    <w:lvl w:ilvl="2" w:tentative="1">
-      <w:start w:val="1"/>
-      <w:numFmt w:val="decimal"/>
-      <w:lvlText w:val="%3."/>
-      <w:lvlJc w:val="left"/>
-      <w:pPr>
-        <w:tabs>
-          <w:tab w:val="num" w:pos="2160"/>
-        </w:tabs>
-        <w:ind w:left="2160" w:hanging="360"/>
-      </w:pPr>
-    </w:lvl>
-    <w:lvl w:ilvl="3" w:tentative="1">
-      <w:start w:val="1"/>
-      <w:numFmt w:val="decimal"/>
-      <w:lvlText w:val="%4."/>
-      <w:lvlJc w:val="left"/>
-      <w:pPr>
-        <w:tabs>
-          <w:tab w:val="num" w:pos="2880"/>
-        </w:tabs>
-        <w:ind w:left="2880" w:hanging="360"/>
-      </w:pPr>
-    </w:lvl>
-    <w:lvl w:ilvl="4" w:tentative="1">
-      <w:start w:val="1"/>
-      <w:numFmt w:val="decimal"/>
-      <w:lvlText w:val="%5."/>
-      <w:lvlJc w:val="left"/>
-      <w:pPr>
-        <w:tabs>
-          <w:tab w:val="num" w:pos="3600"/>
-        </w:tabs>
-        <w:ind w:left="3600" w:hanging="360"/>
-      </w:pPr>
-    </w:lvl>
-    <w:lvl w:ilvl="5" w:tentative="1">
-      <w:start w:val="1"/>
-      <w:numFmt w:val="decimal"/>
-      <w:lvlText w:val="%6."/>
-      <w:lvlJc w:val="left"/>
-      <w:pPr>
-        <w:tabs>
-          <w:tab w:val="num" w:pos="4320"/>
-        </w:tabs>
-        <w:ind w:left="4320" w:hanging="360"/>
-      </w:pPr>
-    </w:lvl>
-    <w:lvl w:ilvl="6" w:tentative="1">
-      <w:start w:val="1"/>
-      <w:numFmt w:val="decimal"/>
-      <w:lvlText w:val="%7."/>
-      <w:lvlJc w:val="left"/>
-      <w:pPr>
-        <w:tabs>
-          <w:tab w:val="num" w:pos="5040"/>
-        </w:tabs>
-        <w:ind w:left="5040" w:hanging="360"/>
-      </w:pPr>
-    </w:lvl>
-    <w:lvl w:ilvl="7" w:tentative="1">
-      <w:start w:val="1"/>
-      <w:numFmt w:val="decimal"/>
-      <w:lvlText w:val="%8."/>
-      <w:lvlJc w:val="left"/>
-      <w:pPr>
-        <w:tabs>
-          <w:tab w:val="num" w:pos="5760"/>
-        </w:tabs>
-        <w:ind w:left="5760" w:hanging="360"/>
-      </w:pPr>
-    </w:lvl>
-    <w:lvl w:ilvl="8" w:tentative="1">
-      <w:start w:val="1"/>
-      <w:numFmt w:val="decimal"/>
-      <w:lvlText w:val="%9."/>
-      <w:lvlJc w:val="left"/>
-      <w:pPr>
-        <w:tabs>
-          <w:tab w:val="num" w:pos="6480"/>
-        </w:tabs>
-        <w:ind w:left="6480" w:hanging="360"/>
-      </w:pPr>
-    </w:lvl>
-  </w:abstractNum>
-  <w:abstractNum w:abstractNumId="43" w15:restartNumberingAfterBreak="0">
-    <w:nsid w:val="63A03EB8"/>
-    <w:multiLevelType w:val="multilevel"/>
-    <w:tmpl w:val="CA34C28A"/>
-    <w:lvl w:ilvl="0">
-      <w:start w:val="1"/>
-      <w:numFmt w:val="decimal"/>
-      <w:lvlText w:val="%1."/>
-      <w:lvlJc w:val="left"/>
-      <w:pPr>
-        <w:tabs>
-          <w:tab w:val="num" w:pos="720"/>
-        </w:tabs>
-        <w:ind w:left="720" w:hanging="360"/>
-      </w:pPr>
-    </w:lvl>
-    <w:lvl w:ilvl="1" w:tentative="1">
-      <w:start w:val="1"/>
-      <w:numFmt w:val="decimal"/>
-      <w:lvlText w:val="%2."/>
-      <w:lvlJc w:val="left"/>
-      <w:pPr>
-        <w:tabs>
-          <w:tab w:val="num" w:pos="1440"/>
-        </w:tabs>
-        <w:ind w:left="1440" w:hanging="360"/>
-      </w:pPr>
-    </w:lvl>
-    <w:lvl w:ilvl="2" w:tentative="1">
-      <w:start w:val="1"/>
-      <w:numFmt w:val="decimal"/>
-      <w:lvlText w:val="%3."/>
-      <w:lvlJc w:val="left"/>
-      <w:pPr>
-        <w:tabs>
-          <w:tab w:val="num" w:pos="2160"/>
-        </w:tabs>
-        <w:ind w:left="2160" w:hanging="360"/>
-      </w:pPr>
-    </w:lvl>
-    <w:lvl w:ilvl="3" w:tentative="1">
-      <w:start w:val="1"/>
-      <w:numFmt w:val="decimal"/>
-      <w:lvlText w:val="%4."/>
-      <w:lvlJc w:val="left"/>
-      <w:pPr>
-        <w:tabs>
-          <w:tab w:val="num" w:pos="2880"/>
-        </w:tabs>
-        <w:ind w:left="2880" w:hanging="360"/>
-      </w:pPr>
-    </w:lvl>
-    <w:lvl w:ilvl="4" w:tentative="1">
-      <w:start w:val="1"/>
-      <w:numFmt w:val="decimal"/>
-      <w:lvlText w:val="%5."/>
-      <w:lvlJc w:val="left"/>
-      <w:pPr>
-        <w:tabs>
-          <w:tab w:val="num" w:pos="3600"/>
-        </w:tabs>
-        <w:ind w:left="3600" w:hanging="360"/>
-      </w:pPr>
-    </w:lvl>
-    <w:lvl w:ilvl="5" w:tentative="1">
-      <w:start w:val="1"/>
-      <w:numFmt w:val="decimal"/>
-      <w:lvlText w:val="%6."/>
-      <w:lvlJc w:val="left"/>
-      <w:pPr>
-        <w:tabs>
-          <w:tab w:val="num" w:pos="4320"/>
-        </w:tabs>
-        <w:ind w:left="4320" w:hanging="360"/>
-      </w:pPr>
-    </w:lvl>
-    <w:lvl w:ilvl="6" w:tentative="1">
-      <w:start w:val="1"/>
-      <w:numFmt w:val="decimal"/>
-      <w:lvlText w:val="%7."/>
-      <w:lvlJc w:val="left"/>
-      <w:pPr>
-        <w:tabs>
-          <w:tab w:val="num" w:pos="5040"/>
-        </w:tabs>
-        <w:ind w:left="5040" w:hanging="360"/>
-      </w:pPr>
-    </w:lvl>
-    <w:lvl w:ilvl="7" w:tentative="1">
-      <w:start w:val="1"/>
-      <w:numFmt w:val="decimal"/>
-      <w:lvlText w:val="%8."/>
-      <w:lvlJc w:val="left"/>
-      <w:pPr>
-        <w:tabs>
-          <w:tab w:val="num" w:pos="5760"/>
-        </w:tabs>
-        <w:ind w:left="5760" w:hanging="360"/>
-      </w:pPr>
-    </w:lvl>
-    <w:lvl w:ilvl="8" w:tentative="1">
-      <w:start w:val="1"/>
-      <w:numFmt w:val="decimal"/>
-      <w:lvlText w:val="%9."/>
-      <w:lvlJc w:val="left"/>
-      <w:pPr>
-        <w:tabs>
-          <w:tab w:val="num" w:pos="6480"/>
-        </w:tabs>
-        <w:ind w:left="6480" w:hanging="360"/>
-      </w:pPr>
-    </w:lvl>
-  </w:abstractNum>
-  <w:abstractNum w:abstractNumId="44" w15:restartNumberingAfterBreak="0">
+  <w:abstractNum w:abstractNumId="29" w15:restartNumberingAfterBreak="0">
     <w:nsid w:val="66A04B9F"/>
     <w:multiLevelType w:val="multilevel"/>
     <w:tmpl w:val="9832592E"/>
@@ -40332,7 +39393,7 @@
       </w:rPr>
     </w:lvl>
   </w:abstractNum>
-  <w:abstractNum w:abstractNumId="45" w15:restartNumberingAfterBreak="0">
+  <w:abstractNum w:abstractNumId="30" w15:restartNumberingAfterBreak="0">
     <w:nsid w:val="676844F6"/>
     <w:multiLevelType w:val="multilevel"/>
     <w:tmpl w:val="9FDAE83A"/>
@@ -40445,7 +39506,7 @@
       </w:pPr>
     </w:lvl>
   </w:abstractNum>
-  <w:abstractNum w:abstractNumId="46" w15:restartNumberingAfterBreak="0">
+  <w:abstractNum w:abstractNumId="31" w15:restartNumberingAfterBreak="0">
     <w:nsid w:val="68C47CBB"/>
     <w:multiLevelType w:val="multilevel"/>
     <w:tmpl w:val="D70ECBEC"/>
@@ -40558,7 +39619,7 @@
       </w:pPr>
     </w:lvl>
   </w:abstractNum>
-  <w:abstractNum w:abstractNumId="47" w15:restartNumberingAfterBreak="0">
+  <w:abstractNum w:abstractNumId="32" w15:restartNumberingAfterBreak="0">
     <w:nsid w:val="6A8F407B"/>
     <w:multiLevelType w:val="multilevel"/>
     <w:tmpl w:val="D41E306A"/>
@@ -40671,7 +39732,7 @@
       </w:pPr>
     </w:lvl>
   </w:abstractNum>
-  <w:abstractNum w:abstractNumId="48" w15:restartNumberingAfterBreak="0">
+  <w:abstractNum w:abstractNumId="33" w15:restartNumberingAfterBreak="0">
     <w:nsid w:val="6C634FCE"/>
     <w:multiLevelType w:val="multilevel"/>
     <w:tmpl w:val="9F16B8E2"/>
@@ -40820,7 +39881,7 @@
       </w:rPr>
     </w:lvl>
   </w:abstractNum>
-  <w:abstractNum w:abstractNumId="49" w15:restartNumberingAfterBreak="0">
+  <w:abstractNum w:abstractNumId="34" w15:restartNumberingAfterBreak="0">
     <w:nsid w:val="6CED03E4"/>
     <w:multiLevelType w:val="multilevel"/>
     <w:tmpl w:val="05F4AC4A"/>
@@ -40933,7 +39994,7 @@
       </w:pPr>
     </w:lvl>
   </w:abstractNum>
-  <w:abstractNum w:abstractNumId="50" w15:restartNumberingAfterBreak="0">
+  <w:abstractNum w:abstractNumId="35" w15:restartNumberingAfterBreak="0">
     <w:nsid w:val="6CF23EC1"/>
     <w:multiLevelType w:val="multilevel"/>
     <w:tmpl w:val="8BF6CB10"/>
@@ -41046,233 +40107,7 @@
       </w:pPr>
     </w:lvl>
   </w:abstractNum>
-  <w:abstractNum w:abstractNumId="51" w15:restartNumberingAfterBreak="0">
-    <w:nsid w:val="6EDF22A4"/>
-    <w:multiLevelType w:val="multilevel"/>
-    <w:tmpl w:val="4B4CFF4C"/>
-    <w:lvl w:ilvl="0">
-      <w:start w:val="1"/>
-      <w:numFmt w:val="decimal"/>
-      <w:lvlText w:val="%1."/>
-      <w:lvlJc w:val="left"/>
-      <w:pPr>
-        <w:tabs>
-          <w:tab w:val="num" w:pos="720"/>
-        </w:tabs>
-        <w:ind w:left="720" w:hanging="360"/>
-      </w:pPr>
-    </w:lvl>
-    <w:lvl w:ilvl="1" w:tentative="1">
-      <w:start w:val="1"/>
-      <w:numFmt w:val="decimal"/>
-      <w:lvlText w:val="%2."/>
-      <w:lvlJc w:val="left"/>
-      <w:pPr>
-        <w:tabs>
-          <w:tab w:val="num" w:pos="1440"/>
-        </w:tabs>
-        <w:ind w:left="1440" w:hanging="360"/>
-      </w:pPr>
-    </w:lvl>
-    <w:lvl w:ilvl="2" w:tentative="1">
-      <w:start w:val="1"/>
-      <w:numFmt w:val="decimal"/>
-      <w:lvlText w:val="%3."/>
-      <w:lvlJc w:val="left"/>
-      <w:pPr>
-        <w:tabs>
-          <w:tab w:val="num" w:pos="2160"/>
-        </w:tabs>
-        <w:ind w:left="2160" w:hanging="360"/>
-      </w:pPr>
-    </w:lvl>
-    <w:lvl w:ilvl="3" w:tentative="1">
-      <w:start w:val="1"/>
-      <w:numFmt w:val="decimal"/>
-      <w:lvlText w:val="%4."/>
-      <w:lvlJc w:val="left"/>
-      <w:pPr>
-        <w:tabs>
-          <w:tab w:val="num" w:pos="2880"/>
-        </w:tabs>
-        <w:ind w:left="2880" w:hanging="360"/>
-      </w:pPr>
-    </w:lvl>
-    <w:lvl w:ilvl="4" w:tentative="1">
-      <w:start w:val="1"/>
-      <w:numFmt w:val="decimal"/>
-      <w:lvlText w:val="%5."/>
-      <w:lvlJc w:val="left"/>
-      <w:pPr>
-        <w:tabs>
-          <w:tab w:val="num" w:pos="3600"/>
-        </w:tabs>
-        <w:ind w:left="3600" w:hanging="360"/>
-      </w:pPr>
-    </w:lvl>
-    <w:lvl w:ilvl="5" w:tentative="1">
-      <w:start w:val="1"/>
-      <w:numFmt w:val="decimal"/>
-      <w:lvlText w:val="%6."/>
-      <w:lvlJc w:val="left"/>
-      <w:pPr>
-        <w:tabs>
-          <w:tab w:val="num" w:pos="4320"/>
-        </w:tabs>
-        <w:ind w:left="4320" w:hanging="360"/>
-      </w:pPr>
-    </w:lvl>
-    <w:lvl w:ilvl="6" w:tentative="1">
-      <w:start w:val="1"/>
-      <w:numFmt w:val="decimal"/>
-      <w:lvlText w:val="%7."/>
-      <w:lvlJc w:val="left"/>
-      <w:pPr>
-        <w:tabs>
-          <w:tab w:val="num" w:pos="5040"/>
-        </w:tabs>
-        <w:ind w:left="5040" w:hanging="360"/>
-      </w:pPr>
-    </w:lvl>
-    <w:lvl w:ilvl="7" w:tentative="1">
-      <w:start w:val="1"/>
-      <w:numFmt w:val="decimal"/>
-      <w:lvlText w:val="%8."/>
-      <w:lvlJc w:val="left"/>
-      <w:pPr>
-        <w:tabs>
-          <w:tab w:val="num" w:pos="5760"/>
-        </w:tabs>
-        <w:ind w:left="5760" w:hanging="360"/>
-      </w:pPr>
-    </w:lvl>
-    <w:lvl w:ilvl="8" w:tentative="1">
-      <w:start w:val="1"/>
-      <w:numFmt w:val="decimal"/>
-      <w:lvlText w:val="%9."/>
-      <w:lvlJc w:val="left"/>
-      <w:pPr>
-        <w:tabs>
-          <w:tab w:val="num" w:pos="6480"/>
-        </w:tabs>
-        <w:ind w:left="6480" w:hanging="360"/>
-      </w:pPr>
-    </w:lvl>
-  </w:abstractNum>
-  <w:abstractNum w:abstractNumId="52" w15:restartNumberingAfterBreak="0">
-    <w:nsid w:val="6F061362"/>
-    <w:multiLevelType w:val="multilevel"/>
-    <w:tmpl w:val="9DC62518"/>
-    <w:lvl w:ilvl="0">
-      <w:start w:val="1"/>
-      <w:numFmt w:val="decimal"/>
-      <w:lvlText w:val="%1."/>
-      <w:lvlJc w:val="left"/>
-      <w:pPr>
-        <w:tabs>
-          <w:tab w:val="num" w:pos="720"/>
-        </w:tabs>
-        <w:ind w:left="720" w:hanging="360"/>
-      </w:pPr>
-    </w:lvl>
-    <w:lvl w:ilvl="1" w:tentative="1">
-      <w:start w:val="1"/>
-      <w:numFmt w:val="decimal"/>
-      <w:lvlText w:val="%2."/>
-      <w:lvlJc w:val="left"/>
-      <w:pPr>
-        <w:tabs>
-          <w:tab w:val="num" w:pos="1440"/>
-        </w:tabs>
-        <w:ind w:left="1440" w:hanging="360"/>
-      </w:pPr>
-    </w:lvl>
-    <w:lvl w:ilvl="2" w:tentative="1">
-      <w:start w:val="1"/>
-      <w:numFmt w:val="decimal"/>
-      <w:lvlText w:val="%3."/>
-      <w:lvlJc w:val="left"/>
-      <w:pPr>
-        <w:tabs>
-          <w:tab w:val="num" w:pos="2160"/>
-        </w:tabs>
-        <w:ind w:left="2160" w:hanging="360"/>
-      </w:pPr>
-    </w:lvl>
-    <w:lvl w:ilvl="3" w:tentative="1">
-      <w:start w:val="1"/>
-      <w:numFmt w:val="decimal"/>
-      <w:lvlText w:val="%4."/>
-      <w:lvlJc w:val="left"/>
-      <w:pPr>
-        <w:tabs>
-          <w:tab w:val="num" w:pos="2880"/>
-        </w:tabs>
-        <w:ind w:left="2880" w:hanging="360"/>
-      </w:pPr>
-    </w:lvl>
-    <w:lvl w:ilvl="4" w:tentative="1">
-      <w:start w:val="1"/>
-      <w:numFmt w:val="decimal"/>
-      <w:lvlText w:val="%5."/>
-      <w:lvlJc w:val="left"/>
-      <w:pPr>
-        <w:tabs>
-          <w:tab w:val="num" w:pos="3600"/>
-        </w:tabs>
-        <w:ind w:left="3600" w:hanging="360"/>
-      </w:pPr>
-    </w:lvl>
-    <w:lvl w:ilvl="5" w:tentative="1">
-      <w:start w:val="1"/>
-      <w:numFmt w:val="decimal"/>
-      <w:lvlText w:val="%6."/>
-      <w:lvlJc w:val="left"/>
-      <w:pPr>
-        <w:tabs>
-          <w:tab w:val="num" w:pos="4320"/>
-        </w:tabs>
-        <w:ind w:left="4320" w:hanging="360"/>
-      </w:pPr>
-    </w:lvl>
-    <w:lvl w:ilvl="6" w:tentative="1">
-      <w:start w:val="1"/>
-      <w:numFmt w:val="decimal"/>
-      <w:lvlText w:val="%7."/>
-      <w:lvlJc w:val="left"/>
-      <w:pPr>
-        <w:tabs>
-          <w:tab w:val="num" w:pos="5040"/>
-        </w:tabs>
-        <w:ind w:left="5040" w:hanging="360"/>
-      </w:pPr>
-    </w:lvl>
-    <w:lvl w:ilvl="7" w:tentative="1">
-      <w:start w:val="1"/>
-      <w:numFmt w:val="decimal"/>
-      <w:lvlText w:val="%8."/>
-      <w:lvlJc w:val="left"/>
-      <w:pPr>
-        <w:tabs>
-          <w:tab w:val="num" w:pos="5760"/>
-        </w:tabs>
-        <w:ind w:left="5760" w:hanging="360"/>
-      </w:pPr>
-    </w:lvl>
-    <w:lvl w:ilvl="8" w:tentative="1">
-      <w:start w:val="1"/>
-      <w:numFmt w:val="decimal"/>
-      <w:lvlText w:val="%9."/>
-      <w:lvlJc w:val="left"/>
-      <w:pPr>
-        <w:tabs>
-          <w:tab w:val="num" w:pos="6480"/>
-        </w:tabs>
-        <w:ind w:left="6480" w:hanging="360"/>
-      </w:pPr>
-    </w:lvl>
-  </w:abstractNum>
-  <w:abstractNum w:abstractNumId="53" w15:restartNumberingAfterBreak="0">
+  <w:abstractNum w:abstractNumId="36" w15:restartNumberingAfterBreak="0">
     <w:nsid w:val="725C74D2"/>
     <w:multiLevelType w:val="multilevel"/>
     <w:tmpl w:val="BA665C9C"/>
@@ -41421,233 +40256,7 @@
       </w:rPr>
     </w:lvl>
   </w:abstractNum>
-  <w:abstractNum w:abstractNumId="54" w15:restartNumberingAfterBreak="0">
-    <w:nsid w:val="76573E84"/>
-    <w:multiLevelType w:val="multilevel"/>
-    <w:tmpl w:val="13F60BE8"/>
-    <w:lvl w:ilvl="0">
-      <w:start w:val="1"/>
-      <w:numFmt w:val="decimal"/>
-      <w:lvlText w:val="%1."/>
-      <w:lvlJc w:val="left"/>
-      <w:pPr>
-        <w:tabs>
-          <w:tab w:val="num" w:pos="720"/>
-        </w:tabs>
-        <w:ind w:left="720" w:hanging="360"/>
-      </w:pPr>
-    </w:lvl>
-    <w:lvl w:ilvl="1" w:tentative="1">
-      <w:start w:val="1"/>
-      <w:numFmt w:val="decimal"/>
-      <w:lvlText w:val="%2."/>
-      <w:lvlJc w:val="left"/>
-      <w:pPr>
-        <w:tabs>
-          <w:tab w:val="num" w:pos="1440"/>
-        </w:tabs>
-        <w:ind w:left="1440" w:hanging="360"/>
-      </w:pPr>
-    </w:lvl>
-    <w:lvl w:ilvl="2" w:tentative="1">
-      <w:start w:val="1"/>
-      <w:numFmt w:val="decimal"/>
-      <w:lvlText w:val="%3."/>
-      <w:lvlJc w:val="left"/>
-      <w:pPr>
-        <w:tabs>
-          <w:tab w:val="num" w:pos="2160"/>
-        </w:tabs>
-        <w:ind w:left="2160" w:hanging="360"/>
-      </w:pPr>
-    </w:lvl>
-    <w:lvl w:ilvl="3" w:tentative="1">
-      <w:start w:val="1"/>
-      <w:numFmt w:val="decimal"/>
-      <w:lvlText w:val="%4."/>
-      <w:lvlJc w:val="left"/>
-      <w:pPr>
-        <w:tabs>
-          <w:tab w:val="num" w:pos="2880"/>
-        </w:tabs>
-        <w:ind w:left="2880" w:hanging="360"/>
-      </w:pPr>
-    </w:lvl>
-    <w:lvl w:ilvl="4" w:tentative="1">
-      <w:start w:val="1"/>
-      <w:numFmt w:val="decimal"/>
-      <w:lvlText w:val="%5."/>
-      <w:lvlJc w:val="left"/>
-      <w:pPr>
-        <w:tabs>
-          <w:tab w:val="num" w:pos="3600"/>
-        </w:tabs>
-        <w:ind w:left="3600" w:hanging="360"/>
-      </w:pPr>
-    </w:lvl>
-    <w:lvl w:ilvl="5" w:tentative="1">
-      <w:start w:val="1"/>
-      <w:numFmt w:val="decimal"/>
-      <w:lvlText w:val="%6."/>
-      <w:lvlJc w:val="left"/>
-      <w:pPr>
-        <w:tabs>
-          <w:tab w:val="num" w:pos="4320"/>
-        </w:tabs>
-        <w:ind w:left="4320" w:hanging="360"/>
-      </w:pPr>
-    </w:lvl>
-    <w:lvl w:ilvl="6" w:tentative="1">
-      <w:start w:val="1"/>
-      <w:numFmt w:val="decimal"/>
-      <w:lvlText w:val="%7."/>
-      <w:lvlJc w:val="left"/>
-      <w:pPr>
-        <w:tabs>
-          <w:tab w:val="num" w:pos="5040"/>
-        </w:tabs>
-        <w:ind w:left="5040" w:hanging="360"/>
-      </w:pPr>
-    </w:lvl>
-    <w:lvl w:ilvl="7" w:tentative="1">
-      <w:start w:val="1"/>
-      <w:numFmt w:val="decimal"/>
-      <w:lvlText w:val="%8."/>
-      <w:lvlJc w:val="left"/>
-      <w:pPr>
-        <w:tabs>
-          <w:tab w:val="num" w:pos="5760"/>
-        </w:tabs>
-        <w:ind w:left="5760" w:hanging="360"/>
-      </w:pPr>
-    </w:lvl>
-    <w:lvl w:ilvl="8" w:tentative="1">
-      <w:start w:val="1"/>
-      <w:numFmt w:val="decimal"/>
-      <w:lvlText w:val="%9."/>
-      <w:lvlJc w:val="left"/>
-      <w:pPr>
-        <w:tabs>
-          <w:tab w:val="num" w:pos="6480"/>
-        </w:tabs>
-        <w:ind w:left="6480" w:hanging="360"/>
-      </w:pPr>
-    </w:lvl>
-  </w:abstractNum>
-  <w:abstractNum w:abstractNumId="55" w15:restartNumberingAfterBreak="0">
-    <w:nsid w:val="76D1054D"/>
-    <w:multiLevelType w:val="multilevel"/>
-    <w:tmpl w:val="32A44548"/>
-    <w:lvl w:ilvl="0">
-      <w:start w:val="1"/>
-      <w:numFmt w:val="decimal"/>
-      <w:lvlText w:val="%1."/>
-      <w:lvlJc w:val="left"/>
-      <w:pPr>
-        <w:tabs>
-          <w:tab w:val="num" w:pos="720"/>
-        </w:tabs>
-        <w:ind w:left="720" w:hanging="360"/>
-      </w:pPr>
-    </w:lvl>
-    <w:lvl w:ilvl="1" w:tentative="1">
-      <w:start w:val="1"/>
-      <w:numFmt w:val="decimal"/>
-      <w:lvlText w:val="%2."/>
-      <w:lvlJc w:val="left"/>
-      <w:pPr>
-        <w:tabs>
-          <w:tab w:val="num" w:pos="1440"/>
-        </w:tabs>
-        <w:ind w:left="1440" w:hanging="360"/>
-      </w:pPr>
-    </w:lvl>
-    <w:lvl w:ilvl="2" w:tentative="1">
-      <w:start w:val="1"/>
-      <w:numFmt w:val="decimal"/>
-      <w:lvlText w:val="%3."/>
-      <w:lvlJc w:val="left"/>
-      <w:pPr>
-        <w:tabs>
-          <w:tab w:val="num" w:pos="2160"/>
-        </w:tabs>
-        <w:ind w:left="2160" w:hanging="360"/>
-      </w:pPr>
-    </w:lvl>
-    <w:lvl w:ilvl="3" w:tentative="1">
-      <w:start w:val="1"/>
-      <w:numFmt w:val="decimal"/>
-      <w:lvlText w:val="%4."/>
-      <w:lvlJc w:val="left"/>
-      <w:pPr>
-        <w:tabs>
-          <w:tab w:val="num" w:pos="2880"/>
-        </w:tabs>
-        <w:ind w:left="2880" w:hanging="360"/>
-      </w:pPr>
-    </w:lvl>
-    <w:lvl w:ilvl="4" w:tentative="1">
-      <w:start w:val="1"/>
-      <w:numFmt w:val="decimal"/>
-      <w:lvlText w:val="%5."/>
-      <w:lvlJc w:val="left"/>
-      <w:pPr>
-        <w:tabs>
-          <w:tab w:val="num" w:pos="3600"/>
-        </w:tabs>
-        <w:ind w:left="3600" w:hanging="360"/>
-      </w:pPr>
-    </w:lvl>
-    <w:lvl w:ilvl="5" w:tentative="1">
-      <w:start w:val="1"/>
-      <w:numFmt w:val="decimal"/>
-      <w:lvlText w:val="%6."/>
-      <w:lvlJc w:val="left"/>
-      <w:pPr>
-        <w:tabs>
-          <w:tab w:val="num" w:pos="4320"/>
-        </w:tabs>
-        <w:ind w:left="4320" w:hanging="360"/>
-      </w:pPr>
-    </w:lvl>
-    <w:lvl w:ilvl="6" w:tentative="1">
-      <w:start w:val="1"/>
-      <w:numFmt w:val="decimal"/>
-      <w:lvlText w:val="%7."/>
-      <w:lvlJc w:val="left"/>
-      <w:pPr>
-        <w:tabs>
-          <w:tab w:val="num" w:pos="5040"/>
-        </w:tabs>
-        <w:ind w:left="5040" w:hanging="360"/>
-      </w:pPr>
-    </w:lvl>
-    <w:lvl w:ilvl="7" w:tentative="1">
-      <w:start w:val="1"/>
-      <w:numFmt w:val="decimal"/>
-      <w:lvlText w:val="%8."/>
-      <w:lvlJc w:val="left"/>
-      <w:pPr>
-        <w:tabs>
-          <w:tab w:val="num" w:pos="5760"/>
-        </w:tabs>
-        <w:ind w:left="5760" w:hanging="360"/>
-      </w:pPr>
-    </w:lvl>
-    <w:lvl w:ilvl="8" w:tentative="1">
-      <w:start w:val="1"/>
-      <w:numFmt w:val="decimal"/>
-      <w:lvlText w:val="%9."/>
-      <w:lvlJc w:val="left"/>
-      <w:pPr>
-        <w:tabs>
-          <w:tab w:val="num" w:pos="6480"/>
-        </w:tabs>
-        <w:ind w:left="6480" w:hanging="360"/>
-      </w:pPr>
-    </w:lvl>
-  </w:abstractNum>
-  <w:abstractNum w:abstractNumId="56" w15:restartNumberingAfterBreak="0">
+  <w:abstractNum w:abstractNumId="37" w15:restartNumberingAfterBreak="0">
     <w:nsid w:val="787A229F"/>
     <w:multiLevelType w:val="multilevel"/>
     <w:tmpl w:val="DD583DAC"/>
@@ -41760,7 +40369,7 @@
       </w:pPr>
     </w:lvl>
   </w:abstractNum>
-  <w:abstractNum w:abstractNumId="57" w15:restartNumberingAfterBreak="0">
+  <w:abstractNum w:abstractNumId="38" w15:restartNumberingAfterBreak="0">
     <w:nsid w:val="78A06D2D"/>
     <w:multiLevelType w:val="multilevel"/>
     <w:tmpl w:val="3D26575A"/>
@@ -41873,120 +40482,7 @@
       </w:pPr>
     </w:lvl>
   </w:abstractNum>
-  <w:abstractNum w:abstractNumId="58" w15:restartNumberingAfterBreak="0">
-    <w:nsid w:val="78EC52D0"/>
-    <w:multiLevelType w:val="multilevel"/>
-    <w:tmpl w:val="745086B8"/>
-    <w:lvl w:ilvl="0">
-      <w:start w:val="1"/>
-      <w:numFmt w:val="decimal"/>
-      <w:lvlText w:val="%1."/>
-      <w:lvlJc w:val="left"/>
-      <w:pPr>
-        <w:tabs>
-          <w:tab w:val="num" w:pos="720"/>
-        </w:tabs>
-        <w:ind w:left="720" w:hanging="360"/>
-      </w:pPr>
-    </w:lvl>
-    <w:lvl w:ilvl="1" w:tentative="1">
-      <w:start w:val="1"/>
-      <w:numFmt w:val="decimal"/>
-      <w:lvlText w:val="%2."/>
-      <w:lvlJc w:val="left"/>
-      <w:pPr>
-        <w:tabs>
-          <w:tab w:val="num" w:pos="1440"/>
-        </w:tabs>
-        <w:ind w:left="1440" w:hanging="360"/>
-      </w:pPr>
-    </w:lvl>
-    <w:lvl w:ilvl="2" w:tentative="1">
-      <w:start w:val="1"/>
-      <w:numFmt w:val="decimal"/>
-      <w:lvlText w:val="%3."/>
-      <w:lvlJc w:val="left"/>
-      <w:pPr>
-        <w:tabs>
-          <w:tab w:val="num" w:pos="2160"/>
-        </w:tabs>
-        <w:ind w:left="2160" w:hanging="360"/>
-      </w:pPr>
-    </w:lvl>
-    <w:lvl w:ilvl="3" w:tentative="1">
-      <w:start w:val="1"/>
-      <w:numFmt w:val="decimal"/>
-      <w:lvlText w:val="%4."/>
-      <w:lvlJc w:val="left"/>
-      <w:pPr>
-        <w:tabs>
-          <w:tab w:val="num" w:pos="2880"/>
-        </w:tabs>
-        <w:ind w:left="2880" w:hanging="360"/>
-      </w:pPr>
-    </w:lvl>
-    <w:lvl w:ilvl="4" w:tentative="1">
-      <w:start w:val="1"/>
-      <w:numFmt w:val="decimal"/>
-      <w:lvlText w:val="%5."/>
-      <w:lvlJc w:val="left"/>
-      <w:pPr>
-        <w:tabs>
-          <w:tab w:val="num" w:pos="3600"/>
-        </w:tabs>
-        <w:ind w:left="3600" w:hanging="360"/>
-      </w:pPr>
-    </w:lvl>
-    <w:lvl w:ilvl="5" w:tentative="1">
-      <w:start w:val="1"/>
-      <w:numFmt w:val="decimal"/>
-      <w:lvlText w:val="%6."/>
-      <w:lvlJc w:val="left"/>
-      <w:pPr>
-        <w:tabs>
-          <w:tab w:val="num" w:pos="4320"/>
-        </w:tabs>
-        <w:ind w:left="4320" w:hanging="360"/>
-      </w:pPr>
-    </w:lvl>
-    <w:lvl w:ilvl="6" w:tentative="1">
-      <w:start w:val="1"/>
-      <w:numFmt w:val="decimal"/>
-      <w:lvlText w:val="%7."/>
-      <w:lvlJc w:val="left"/>
-      <w:pPr>
-        <w:tabs>
-          <w:tab w:val="num" w:pos="5040"/>
-        </w:tabs>
-        <w:ind w:left="5040" w:hanging="360"/>
-      </w:pPr>
-    </w:lvl>
-    <w:lvl w:ilvl="7" w:tentative="1">
-      <w:start w:val="1"/>
-      <w:numFmt w:val="decimal"/>
-      <w:lvlText w:val="%8."/>
-      <w:lvlJc w:val="left"/>
-      <w:pPr>
-        <w:tabs>
-          <w:tab w:val="num" w:pos="5760"/>
-        </w:tabs>
-        <w:ind w:left="5760" w:hanging="360"/>
-      </w:pPr>
-    </w:lvl>
-    <w:lvl w:ilvl="8" w:tentative="1">
-      <w:start w:val="1"/>
-      <w:numFmt w:val="decimal"/>
-      <w:lvlText w:val="%9."/>
-      <w:lvlJc w:val="left"/>
-      <w:pPr>
-        <w:tabs>
-          <w:tab w:val="num" w:pos="6480"/>
-        </w:tabs>
-        <w:ind w:left="6480" w:hanging="360"/>
-      </w:pPr>
-    </w:lvl>
-  </w:abstractNum>
-  <w:abstractNum w:abstractNumId="59" w15:restartNumberingAfterBreak="0">
+  <w:abstractNum w:abstractNumId="39" w15:restartNumberingAfterBreak="0">
     <w:nsid w:val="7959213B"/>
     <w:multiLevelType w:val="multilevel"/>
     <w:tmpl w:val="3BA20B58"/>
@@ -42135,7 +40631,7 @@
       </w:rPr>
     </w:lvl>
   </w:abstractNum>
-  <w:abstractNum w:abstractNumId="60" w15:restartNumberingAfterBreak="0">
+  <w:abstractNum w:abstractNumId="40" w15:restartNumberingAfterBreak="0">
     <w:nsid w:val="795E6E38"/>
     <w:multiLevelType w:val="multilevel"/>
     <w:tmpl w:val="6988FCAA"/>
@@ -42248,120 +40744,7 @@
       </w:pPr>
     </w:lvl>
   </w:abstractNum>
-  <w:abstractNum w:abstractNumId="61" w15:restartNumberingAfterBreak="0">
-    <w:nsid w:val="7D3655EF"/>
-    <w:multiLevelType w:val="multilevel"/>
-    <w:tmpl w:val="DD441180"/>
-    <w:lvl w:ilvl="0">
-      <w:start w:val="1"/>
-      <w:numFmt w:val="decimal"/>
-      <w:lvlText w:val="%1."/>
-      <w:lvlJc w:val="left"/>
-      <w:pPr>
-        <w:tabs>
-          <w:tab w:val="num" w:pos="720"/>
-        </w:tabs>
-        <w:ind w:left="720" w:hanging="360"/>
-      </w:pPr>
-    </w:lvl>
-    <w:lvl w:ilvl="1" w:tentative="1">
-      <w:start w:val="1"/>
-      <w:numFmt w:val="decimal"/>
-      <w:lvlText w:val="%2."/>
-      <w:lvlJc w:val="left"/>
-      <w:pPr>
-        <w:tabs>
-          <w:tab w:val="num" w:pos="1440"/>
-        </w:tabs>
-        <w:ind w:left="1440" w:hanging="360"/>
-      </w:pPr>
-    </w:lvl>
-    <w:lvl w:ilvl="2" w:tentative="1">
-      <w:start w:val="1"/>
-      <w:numFmt w:val="decimal"/>
-      <w:lvlText w:val="%3."/>
-      <w:lvlJc w:val="left"/>
-      <w:pPr>
-        <w:tabs>
-          <w:tab w:val="num" w:pos="2160"/>
-        </w:tabs>
-        <w:ind w:left="2160" w:hanging="360"/>
-      </w:pPr>
-    </w:lvl>
-    <w:lvl w:ilvl="3" w:tentative="1">
-      <w:start w:val="1"/>
-      <w:numFmt w:val="decimal"/>
-      <w:lvlText w:val="%4."/>
-      <w:lvlJc w:val="left"/>
-      <w:pPr>
-        <w:tabs>
-          <w:tab w:val="num" w:pos="2880"/>
-        </w:tabs>
-        <w:ind w:left="2880" w:hanging="360"/>
-      </w:pPr>
-    </w:lvl>
-    <w:lvl w:ilvl="4" w:tentative="1">
-      <w:start w:val="1"/>
-      <w:numFmt w:val="decimal"/>
-      <w:lvlText w:val="%5."/>
-      <w:lvlJc w:val="left"/>
-      <w:pPr>
-        <w:tabs>
-          <w:tab w:val="num" w:pos="3600"/>
-        </w:tabs>
-        <w:ind w:left="3600" w:hanging="360"/>
-      </w:pPr>
-    </w:lvl>
-    <w:lvl w:ilvl="5" w:tentative="1">
-      <w:start w:val="1"/>
-      <w:numFmt w:val="decimal"/>
-      <w:lvlText w:val="%6."/>
-      <w:lvlJc w:val="left"/>
-      <w:pPr>
-        <w:tabs>
-          <w:tab w:val="num" w:pos="4320"/>
-        </w:tabs>
-        <w:ind w:left="4320" w:hanging="360"/>
-      </w:pPr>
-    </w:lvl>
-    <w:lvl w:ilvl="6" w:tentative="1">
-      <w:start w:val="1"/>
-      <w:numFmt w:val="decimal"/>
-      <w:lvlText w:val="%7."/>
-      <w:lvlJc w:val="left"/>
-      <w:pPr>
-        <w:tabs>
-          <w:tab w:val="num" w:pos="5040"/>
-        </w:tabs>
-        <w:ind w:left="5040" w:hanging="360"/>
-      </w:pPr>
-    </w:lvl>
-    <w:lvl w:ilvl="7" w:tentative="1">
-      <w:start w:val="1"/>
-      <w:numFmt w:val="decimal"/>
-      <w:lvlText w:val="%8."/>
-      <w:lvlJc w:val="left"/>
-      <w:pPr>
-        <w:tabs>
-          <w:tab w:val="num" w:pos="5760"/>
-        </w:tabs>
-        <w:ind w:left="5760" w:hanging="360"/>
-      </w:pPr>
-    </w:lvl>
-    <w:lvl w:ilvl="8" w:tentative="1">
-      <w:start w:val="1"/>
-      <w:numFmt w:val="decimal"/>
-      <w:lvlText w:val="%9."/>
-      <w:lvlJc w:val="left"/>
-      <w:pPr>
-        <w:tabs>
-          <w:tab w:val="num" w:pos="6480"/>
-        </w:tabs>
-        <w:ind w:left="6480" w:hanging="360"/>
-      </w:pPr>
-    </w:lvl>
-  </w:abstractNum>
-  <w:abstractNum w:abstractNumId="62" w15:restartNumberingAfterBreak="0">
+  <w:abstractNum w:abstractNumId="41" w15:restartNumberingAfterBreak="0">
     <w:nsid w:val="7E1C3A25"/>
     <w:multiLevelType w:val="multilevel"/>
     <w:tmpl w:val="D144B418"/>
@@ -42511,194 +40894,132 @@
     </w:lvl>
   </w:abstractNum>
   <w:num w:numId="1" w16cid:durableId="48068686">
-    <w:abstractNumId w:val="16"/>
+    <w:abstractNumId w:val="12"/>
   </w:num>
   <w:num w:numId="2" w16cid:durableId="1720086524">
-    <w:abstractNumId w:val="50"/>
+    <w:abstractNumId w:val="35"/>
   </w:num>
   <w:num w:numId="3" w16cid:durableId="1903323350">
-    <w:abstractNumId w:val="11"/>
+    <w:abstractNumId w:val="8"/>
   </w:num>
   <w:num w:numId="4" w16cid:durableId="928612225">
-    <w:abstractNumId w:val="62"/>
+    <w:abstractNumId w:val="41"/>
   </w:num>
   <w:num w:numId="5" w16cid:durableId="1617054216">
-    <w:abstractNumId w:val="24"/>
+    <w:abstractNumId w:val="19"/>
   </w:num>
   <w:num w:numId="6" w16cid:durableId="1133861616">
-    <w:abstractNumId w:val="37"/>
+    <w:abstractNumId w:val="26"/>
   </w:num>
   <w:num w:numId="7" w16cid:durableId="1089930919">
-    <w:abstractNumId w:val="59"/>
+    <w:abstractNumId w:val="39"/>
   </w:num>
   <w:num w:numId="8" w16cid:durableId="245042077">
-    <w:abstractNumId w:val="39"/>
+    <w:abstractNumId w:val="28"/>
   </w:num>
   <w:num w:numId="9" w16cid:durableId="1893543495">
-    <w:abstractNumId w:val="17"/>
+    <w:abstractNumId w:val="13"/>
   </w:num>
   <w:num w:numId="10" w16cid:durableId="583611169">
     <w:abstractNumId w:val="1"/>
   </w:num>
   <w:num w:numId="11" w16cid:durableId="526525396">
-    <w:abstractNumId w:val="22"/>
+    <w:abstractNumId w:val="17"/>
   </w:num>
   <w:num w:numId="12" w16cid:durableId="1623196039">
+    <w:abstractNumId w:val="11"/>
+  </w:num>
+  <w:num w:numId="13" w16cid:durableId="1583875105">
     <w:abstractNumId w:val="15"/>
   </w:num>
-  <w:num w:numId="13" w16cid:durableId="1583875105">
-    <w:abstractNumId w:val="20"/>
-  </w:num>
   <w:num w:numId="14" w16cid:durableId="72552081">
-    <w:abstractNumId w:val="12"/>
+    <w:abstractNumId w:val="9"/>
   </w:num>
   <w:num w:numId="15" w16cid:durableId="2107769010">
-    <w:abstractNumId w:val="7"/>
+    <w:abstractNumId w:val="6"/>
   </w:num>
   <w:num w:numId="16" w16cid:durableId="463082500">
-    <w:abstractNumId w:val="48"/>
+    <w:abstractNumId w:val="33"/>
   </w:num>
   <w:num w:numId="17" w16cid:durableId="1854951530">
     <w:abstractNumId w:val="0"/>
   </w:num>
   <w:num w:numId="18" w16cid:durableId="389573718">
-    <w:abstractNumId w:val="53"/>
+    <w:abstractNumId w:val="36"/>
   </w:num>
   <w:num w:numId="19" w16cid:durableId="1434129219">
-    <w:abstractNumId w:val="44"/>
+    <w:abstractNumId w:val="29"/>
   </w:num>
   <w:num w:numId="20" w16cid:durableId="908885824">
+    <w:abstractNumId w:val="7"/>
+  </w:num>
+  <w:num w:numId="21" w16cid:durableId="127359943">
+    <w:abstractNumId w:val="3"/>
+  </w:num>
+  <w:num w:numId="22" w16cid:durableId="1234438568">
+    <w:abstractNumId w:val="16"/>
+  </w:num>
+  <w:num w:numId="23" w16cid:durableId="46076030">
+    <w:abstractNumId w:val="14"/>
+  </w:num>
+  <w:num w:numId="24" w16cid:durableId="1164589623">
+    <w:abstractNumId w:val="27"/>
+  </w:num>
+  <w:num w:numId="25" w16cid:durableId="1647857900">
     <w:abstractNumId w:val="10"/>
   </w:num>
-  <w:num w:numId="21" w16cid:durableId="127359943">
+  <w:num w:numId="26" w16cid:durableId="386030422">
+    <w:abstractNumId w:val="20"/>
+  </w:num>
+  <w:num w:numId="27" w16cid:durableId="1032606750">
+    <w:abstractNumId w:val="21"/>
+  </w:num>
+  <w:num w:numId="28" w16cid:durableId="501697864">
+    <w:abstractNumId w:val="23"/>
+  </w:num>
+  <w:num w:numId="29" w16cid:durableId="782768892">
     <w:abstractNumId w:val="4"/>
   </w:num>
-  <w:num w:numId="22" w16cid:durableId="1234438568">
-    <w:abstractNumId w:val="21"/>
+  <w:num w:numId="30" w16cid:durableId="1545798675">
+    <w:abstractNumId w:val="30"/>
   </w:num>
-  <w:num w:numId="23" w16cid:durableId="46076030">
-    <w:abstractNumId w:val="19"/>
+  <w:num w:numId="31" w16cid:durableId="1751073318">
+    <w:abstractNumId w:val="32"/>
   </w:num>
-  <w:num w:numId="24" w16cid:durableId="1164589623">
+  <w:num w:numId="32" w16cid:durableId="1208642732">
+    <w:abstractNumId w:val="40"/>
+  </w:num>
+  <w:num w:numId="33" w16cid:durableId="1943763261">
+    <w:abstractNumId w:val="25"/>
+  </w:num>
+  <w:num w:numId="34" w16cid:durableId="1455324822">
     <w:abstractNumId w:val="38"/>
   </w:num>
-  <w:num w:numId="25" w16cid:durableId="1647857900">
-    <w:abstractNumId w:val="13"/>
+  <w:num w:numId="35" w16cid:durableId="955329464">
+    <w:abstractNumId w:val="2"/>
   </w:num>
-  <w:num w:numId="26" w16cid:durableId="386030422">
-    <w:abstractNumId w:val="26"/>
+  <w:num w:numId="36" w16cid:durableId="515575955">
+    <w:abstractNumId w:val="34"/>
   </w:num>
-  <w:num w:numId="27" w16cid:durableId="1032606750">
-    <w:abstractNumId w:val="28"/>
+  <w:num w:numId="37" w16cid:durableId="513761981">
+    <w:abstractNumId w:val="37"/>
   </w:num>
-  <w:num w:numId="28" w16cid:durableId="501697864">
+  <w:num w:numId="38" w16cid:durableId="2115057823">
+    <w:abstractNumId w:val="22"/>
+  </w:num>
+  <w:num w:numId="39" w16cid:durableId="1501508011">
     <w:abstractNumId w:val="31"/>
   </w:num>
-  <w:num w:numId="29" w16cid:durableId="782768892">
+  <w:num w:numId="40" w16cid:durableId="1793403696">
+    <w:abstractNumId w:val="18"/>
+  </w:num>
+  <w:num w:numId="41" w16cid:durableId="1769736390">
     <w:abstractNumId w:val="5"/>
   </w:num>
-  <w:num w:numId="30" w16cid:durableId="1545798675">
-    <w:abstractNumId w:val="45"/>
+  <w:num w:numId="42" w16cid:durableId="1811363609">
+    <w:abstractNumId w:val="24"/>
   </w:num>
-  <w:num w:numId="31" w16cid:durableId="1751073318">
-    <w:abstractNumId w:val="47"/>
-  </w:num>
-  <w:num w:numId="32" w16cid:durableId="1208642732">
-    <w:abstractNumId w:val="60"/>
-  </w:num>
-  <w:num w:numId="33" w16cid:durableId="1943763261">
-    <w:abstractNumId w:val="36"/>
-  </w:num>
-  <w:num w:numId="34" w16cid:durableId="1455324822">
-    <w:abstractNumId w:val="57"/>
-  </w:num>
-  <w:num w:numId="35" w16cid:durableId="955329464">
-    <w:abstractNumId w:val="3"/>
-  </w:num>
-  <w:num w:numId="36" w16cid:durableId="515575955">
-    <w:abstractNumId w:val="49"/>
-  </w:num>
-  <w:num w:numId="37" w16cid:durableId="513761981">
-    <w:abstractNumId w:val="56"/>
-  </w:num>
-  <w:num w:numId="38" w16cid:durableId="2115057823">
-    <w:abstractNumId w:val="30"/>
-  </w:num>
-  <w:num w:numId="39" w16cid:durableId="1501508011">
-    <w:abstractNumId w:val="46"/>
-  </w:num>
-  <w:num w:numId="40" w16cid:durableId="1793403696">
-    <w:abstractNumId w:val="23"/>
-  </w:num>
-  <w:num w:numId="41" w16cid:durableId="1769736390">
-    <w:abstractNumId w:val="6"/>
-  </w:num>
-  <w:num w:numId="42" w16cid:durableId="1811363609">
-    <w:abstractNumId w:val="33"/>
-  </w:num>
-  <w:num w:numId="43" w16cid:durableId="829911320">
-    <w:abstractNumId w:val="52"/>
-  </w:num>
-  <w:num w:numId="44" w16cid:durableId="1579091449">
-    <w:abstractNumId w:val="43"/>
-  </w:num>
-  <w:num w:numId="45" w16cid:durableId="2106922053">
-    <w:abstractNumId w:val="29"/>
-  </w:num>
-  <w:num w:numId="46" w16cid:durableId="459302971">
-    <w:abstractNumId w:val="27"/>
-  </w:num>
-  <w:num w:numId="47" w16cid:durableId="1694577918">
-    <w:abstractNumId w:val="58"/>
-  </w:num>
-  <w:num w:numId="48" w16cid:durableId="760030770">
-    <w:abstractNumId w:val="25"/>
-  </w:num>
-  <w:num w:numId="49" w16cid:durableId="1140461415">
-    <w:abstractNumId w:val="8"/>
-  </w:num>
-  <w:num w:numId="50" w16cid:durableId="1916625202">
-    <w:abstractNumId w:val="9"/>
-  </w:num>
-  <w:num w:numId="51" w16cid:durableId="1455366224">
-    <w:abstractNumId w:val="61"/>
-  </w:num>
-  <w:num w:numId="52" w16cid:durableId="1757902307">
-    <w:abstractNumId w:val="34"/>
-  </w:num>
-  <w:num w:numId="53" w16cid:durableId="1921212989">
-    <w:abstractNumId w:val="35"/>
-  </w:num>
-  <w:num w:numId="54" w16cid:durableId="584612686">
-    <w:abstractNumId w:val="55"/>
-  </w:num>
-  <w:num w:numId="55" w16cid:durableId="204872244">
-    <w:abstractNumId w:val="18"/>
-  </w:num>
-  <w:num w:numId="56" w16cid:durableId="20129369">
-    <w:abstractNumId w:val="2"/>
-  </w:num>
-  <w:num w:numId="57" w16cid:durableId="1756855616">
-    <w:abstractNumId w:val="41"/>
-  </w:num>
-  <w:num w:numId="58" w16cid:durableId="1213810965">
-    <w:abstractNumId w:val="40"/>
-  </w:num>
-  <w:num w:numId="59" w16cid:durableId="1362320610">
-    <w:abstractNumId w:val="51"/>
-  </w:num>
-  <w:num w:numId="60" w16cid:durableId="229734937">
-    <w:abstractNumId w:val="14"/>
-  </w:num>
-  <w:num w:numId="61" w16cid:durableId="912393865">
-    <w:abstractNumId w:val="42"/>
-  </w:num>
-  <w:num w:numId="62" w16cid:durableId="20517033">
-    <w:abstractNumId w:val="54"/>
-  </w:num>
-  <w:num w:numId="63" w16cid:durableId="24067331">
-    <w:abstractNumId w:val="32"/>
-  </w:num>
+  <w:numIdMacAtCleanup w:val="42"/>
 </w:numbering>
 </file>
 

</xml_diff>